<commit_message>
mise à jour doc
</commit_message>
<xml_diff>
--- a/Step 1/S-P_450-E1_env_test-grp_Matias_Denis.docx
+++ b/Step 1/S-P_450-E1_env_test-grp_Matias_Denis.docx
@@ -4,109 +4,460 @@
   <w:body>
     <w:p>
       <w:pPr>
-        <w:pStyle w:val="Titre1"/>
-      </w:pPr>
-      <w:r>
+        <w:jc w:val="center"/>
+        <w:rPr>
+          <w:rFonts w:ascii="Arial" w:eastAsiaTheme="majorEastAsia" w:hAnsi="Arial" w:cs="Arial"/>
+          <w:color w:val="0F4761" w:themeColor="accent1" w:themeShade="BF"/>
+          <w:sz w:val="40"/>
+          <w:szCs w:val="40"/>
+        </w:rPr>
+      </w:pPr>
+    </w:p>
+    <w:p>
+      <w:pPr>
+        <w:jc w:val="center"/>
+        <w:rPr>
+          <w:rFonts w:ascii="Arial" w:eastAsiaTheme="majorEastAsia" w:hAnsi="Arial" w:cs="Arial"/>
+          <w:color w:val="0F4761" w:themeColor="accent1" w:themeShade="BF"/>
+          <w:sz w:val="40"/>
+          <w:szCs w:val="40"/>
+        </w:rPr>
+      </w:pPr>
+    </w:p>
+    <w:p>
+      <w:pPr>
+        <w:jc w:val="center"/>
+        <w:rPr>
+          <w:rFonts w:ascii="Arial" w:eastAsiaTheme="majorEastAsia" w:hAnsi="Arial" w:cs="Arial"/>
+          <w:color w:val="0F4761" w:themeColor="accent1" w:themeShade="BF"/>
+          <w:sz w:val="40"/>
+          <w:szCs w:val="40"/>
+        </w:rPr>
+      </w:pPr>
+    </w:p>
+    <w:p>
+      <w:pPr>
+        <w:jc w:val="center"/>
+        <w:rPr>
+          <w:rFonts w:ascii="Arial" w:eastAsiaTheme="majorEastAsia" w:hAnsi="Arial" w:cs="Arial"/>
+          <w:color w:val="0F4761" w:themeColor="accent1" w:themeShade="BF"/>
+          <w:sz w:val="40"/>
+          <w:szCs w:val="40"/>
+        </w:rPr>
+      </w:pPr>
+    </w:p>
+    <w:p>
+      <w:pPr>
+        <w:jc w:val="center"/>
+        <w:rPr>
+          <w:rFonts w:ascii="Arial" w:eastAsiaTheme="majorEastAsia" w:hAnsi="Arial" w:cs="Arial"/>
+          <w:color w:val="0F4761" w:themeColor="accent1" w:themeShade="BF"/>
+          <w:sz w:val="40"/>
+          <w:szCs w:val="40"/>
+        </w:rPr>
+      </w:pPr>
+    </w:p>
+    <w:p>
+      <w:pPr>
+        <w:jc w:val="center"/>
+        <w:rPr>
+          <w:rFonts w:ascii="Arial" w:eastAsiaTheme="majorEastAsia" w:hAnsi="Arial" w:cs="Arial"/>
+          <w:color w:val="0F4761" w:themeColor="accent1" w:themeShade="BF"/>
+          <w:sz w:val="40"/>
+          <w:szCs w:val="40"/>
+        </w:rPr>
+      </w:pPr>
+      <w:r>
+        <w:rPr>
+          <w:rFonts w:ascii="Arial" w:eastAsiaTheme="majorEastAsia" w:hAnsi="Arial" w:cs="Arial"/>
+          <w:color w:val="0F4761" w:themeColor="accent1" w:themeShade="BF"/>
+          <w:sz w:val="40"/>
+          <w:szCs w:val="40"/>
+        </w:rPr>
         <w:t>Rapport de mise en place de l’application</w:t>
       </w:r>
     </w:p>
-    <w:p/>
+    <w:p>
+      <w:pPr>
+        <w:jc w:val="center"/>
+        <w:rPr>
+          <w:rFonts w:ascii="Arial" w:eastAsiaTheme="majorEastAsia" w:hAnsi="Arial" w:cs="Arial"/>
+          <w:color w:val="0F4761" w:themeColor="accent1" w:themeShade="BF"/>
+          <w:sz w:val="40"/>
+          <w:szCs w:val="40"/>
+        </w:rPr>
+      </w:pPr>
+      <w:r>
+        <w:rPr>
+          <w:rFonts w:ascii="Arial" w:eastAsiaTheme="majorEastAsia" w:hAnsi="Arial" w:cs="Arial"/>
+          <w:color w:val="0F4761" w:themeColor="accent1" w:themeShade="BF"/>
+          <w:sz w:val="40"/>
+          <w:szCs w:val="40"/>
+        </w:rPr>
+        <w:t xml:space="preserve">– </w:t>
+      </w:r>
+    </w:p>
+    <w:p>
+      <w:pPr>
+        <w:jc w:val="center"/>
+        <w:rPr>
+          <w:rFonts w:ascii="Arial" w:hAnsi="Arial" w:cs="Arial"/>
+        </w:rPr>
+      </w:pPr>
+      <w:r>
+        <w:rPr>
+          <w:rFonts w:ascii="Arial" w:eastAsiaTheme="majorEastAsia" w:hAnsi="Arial" w:cs="Arial"/>
+          <w:color w:val="0F4761" w:themeColor="accent1" w:themeShade="BF"/>
+          <w:sz w:val="40"/>
+          <w:szCs w:val="40"/>
+        </w:rPr>
+        <w:t>Projet TaskTimer (P_450)</w:t>
+      </w:r>
+    </w:p>
+    <w:p>
+      <w:pPr>
+        <w:rPr>
+          <w:rFonts w:ascii="Arial" w:hAnsi="Arial" w:cs="Arial"/>
+        </w:rPr>
+      </w:pPr>
+    </w:p>
+    <w:p>
+      <w:pPr>
+        <w:rPr>
+          <w:rFonts w:ascii="Arial" w:hAnsi="Arial" w:cs="Arial"/>
+        </w:rPr>
+      </w:pPr>
+    </w:p>
+    <w:p>
+      <w:pPr>
+        <w:rPr>
+          <w:rFonts w:ascii="Arial" w:hAnsi="Arial" w:cs="Arial"/>
+        </w:rPr>
+      </w:pPr>
+    </w:p>
+    <w:p>
+      <w:pPr>
+        <w:rPr>
+          <w:rFonts w:ascii="Arial" w:hAnsi="Arial" w:cs="Arial"/>
+        </w:rPr>
+      </w:pPr>
+    </w:p>
+    <w:p>
+      <w:pPr>
+        <w:rPr>
+          <w:rFonts w:ascii="Arial" w:hAnsi="Arial" w:cs="Arial"/>
+        </w:rPr>
+      </w:pPr>
+    </w:p>
+    <w:p>
+      <w:pPr>
+        <w:rPr>
+          <w:rFonts w:ascii="Arial" w:hAnsi="Arial" w:cs="Arial"/>
+        </w:rPr>
+      </w:pPr>
+    </w:p>
+    <w:p>
+      <w:pPr>
+        <w:rPr>
+          <w:rFonts w:ascii="Arial" w:hAnsi="Arial" w:cs="Arial"/>
+        </w:rPr>
+      </w:pPr>
+    </w:p>
+    <w:p>
+      <w:pPr>
+        <w:rPr>
+          <w:rFonts w:ascii="Arial" w:hAnsi="Arial" w:cs="Arial"/>
+        </w:rPr>
+      </w:pPr>
+    </w:p>
+    <w:p>
+      <w:pPr>
+        <w:jc w:val="center"/>
+        <w:rPr>
+          <w:rFonts w:ascii="Arial" w:hAnsi="Arial" w:cs="Arial"/>
+        </w:rPr>
+      </w:pPr>
+      <w:r>
+        <w:rPr>
+          <w:rFonts w:ascii="Arial" w:hAnsi="Arial" w:cs="Arial"/>
+          <w:b/>
+          <w:bCs/>
+        </w:rPr>
+        <w:t>Auteur :</w:t>
+      </w:r>
+      <w:r>
+        <w:rPr>
+          <w:rFonts w:ascii="Arial" w:hAnsi="Arial" w:cs="Arial"/>
+        </w:rPr>
+        <w:t xml:space="preserve"> Matias Denis</w:t>
+      </w:r>
+    </w:p>
+    <w:p>
+      <w:pPr>
+        <w:jc w:val="center"/>
+        <w:rPr>
+          <w:rFonts w:ascii="Arial" w:hAnsi="Arial" w:cs="Arial"/>
+        </w:rPr>
+      </w:pPr>
+      <w:r>
+        <w:rPr>
+          <w:rFonts w:ascii="Arial" w:hAnsi="Arial" w:cs="Arial"/>
+          <w:b/>
+          <w:bCs/>
+        </w:rPr>
+        <w:t>Date :</w:t>
+      </w:r>
+      <w:r>
+        <w:rPr>
+          <w:rFonts w:ascii="Arial" w:hAnsi="Arial" w:cs="Arial"/>
+        </w:rPr>
+        <w:t xml:space="preserve"> 4 </w:t>
+      </w:r>
+      <w:proofErr w:type="gramStart"/>
+      <w:r>
+        <w:rPr>
+          <w:rFonts w:ascii="Arial" w:hAnsi="Arial" w:cs="Arial"/>
+        </w:rPr>
+        <w:t>Février</w:t>
+      </w:r>
+      <w:proofErr w:type="gramEnd"/>
+      <w:r>
+        <w:rPr>
+          <w:rFonts w:ascii="Arial" w:hAnsi="Arial" w:cs="Arial"/>
+        </w:rPr>
+        <w:t xml:space="preserve"> 2026</w:t>
+      </w:r>
+    </w:p>
+    <w:p>
+      <w:pPr>
+        <w:jc w:val="center"/>
+        <w:rPr>
+          <w:rFonts w:ascii="Arial" w:hAnsi="Arial" w:cs="Arial"/>
+        </w:rPr>
+      </w:pPr>
+      <w:r>
+        <w:rPr>
+          <w:rFonts w:ascii="Arial" w:hAnsi="Arial" w:cs="Arial"/>
+          <w:b/>
+          <w:bCs/>
+        </w:rPr>
+        <w:t>Objectif :</w:t>
+      </w:r>
+      <w:r>
+        <w:rPr>
+          <w:rFonts w:ascii="Arial" w:hAnsi="Arial" w:cs="Arial"/>
+        </w:rPr>
+        <w:t xml:space="preserve"> Installer et exécuter l'application </w:t>
+      </w:r>
+      <w:proofErr w:type="spellStart"/>
+      <w:r>
+        <w:rPr>
+          <w:rFonts w:ascii="Arial" w:hAnsi="Arial" w:cs="Arial"/>
+        </w:rPr>
+        <w:t>TaskTimer</w:t>
+      </w:r>
+      <w:proofErr w:type="spellEnd"/>
+      <w:r>
+        <w:rPr>
+          <w:rFonts w:ascii="Arial" w:hAnsi="Arial" w:cs="Arial"/>
+        </w:rPr>
+        <w:t xml:space="preserve"> dans un environnement local pour disposer d'une base fonctionnelle pour les activités de test.</w:t>
+      </w:r>
+    </w:p>
+    <w:p>
+      <w:pPr>
+        <w:rPr>
+          <w:rFonts w:ascii="Arial" w:hAnsi="Arial" w:cs="Arial"/>
+        </w:rPr>
+      </w:pPr>
+      <w:r>
+        <w:rPr>
+          <w:rFonts w:ascii="Arial" w:hAnsi="Arial" w:cs="Arial"/>
+        </w:rPr>
+        <w:br w:type="page"/>
+      </w:r>
+    </w:p>
     <w:p>
       <w:pPr>
         <w:pStyle w:val="Titre2"/>
         <w:numPr>
           <w:ilvl w:val="0"/>
-          <w:numId w:val="2"/>
+          <w:numId w:val="5"/>
         </w:numPr>
-      </w:pPr>
-      <w:r>
-        <w:t>Infrastructure Docker</w:t>
-      </w:r>
-    </w:p>
-    <w:p>
-      <w:r>
-        <w:t>On utilise Docker pour la base de données MySQL.</w:t>
-      </w:r>
-    </w:p>
-    <w:p>
-      <w:r>
-        <w:t>Pour ce faire, on se place dans le répertoire où se trouve le docker-</w:t>
-      </w:r>
+        <w:rPr>
+          <w:rFonts w:ascii="Arial" w:hAnsi="Arial" w:cs="Arial"/>
+        </w:rPr>
+      </w:pPr>
       <w:proofErr w:type="spellStart"/>
       <w:r>
-        <w:t>compose.yml</w:t>
+        <w:rPr>
+          <w:rFonts w:ascii="Arial" w:hAnsi="Arial" w:cs="Arial"/>
+        </w:rPr>
+        <w:lastRenderedPageBreak/>
+        <w:t>Pré-requis</w:t>
       </w:r>
       <w:proofErr w:type="spellEnd"/>
       <w:r>
-        <w:t xml:space="preserve"> et on ouvre un </w:t>
+        <w:rPr>
+          <w:rFonts w:ascii="Arial" w:hAnsi="Arial" w:cs="Arial"/>
+        </w:rPr>
+        <w:t xml:space="preserve"> techniques et environnement</w:t>
+      </w:r>
+    </w:p>
+    <w:p>
+      <w:pPr>
+        <w:rPr>
+          <w:rFonts w:ascii="Arial" w:hAnsi="Arial" w:cs="Arial"/>
+        </w:rPr>
+      </w:pPr>
+      <w:r>
+        <w:rPr>
+          <w:rFonts w:ascii="Arial" w:hAnsi="Arial" w:cs="Arial"/>
+        </w:rPr>
+        <w:t>Pour garantir une reproduction autonome du déploiement, l'environnement suivant est requis :</w:t>
+      </w:r>
+    </w:p>
+    <w:p>
+      <w:pPr>
+        <w:pStyle w:val="Paragraphedeliste"/>
+        <w:numPr>
+          <w:ilvl w:val="0"/>
+          <w:numId w:val="6"/>
+        </w:numPr>
+        <w:rPr>
+          <w:rFonts w:ascii="Arial" w:hAnsi="Arial" w:cs="Arial"/>
+        </w:rPr>
+      </w:pPr>
+      <w:r>
+        <w:rPr>
+          <w:rFonts w:ascii="Arial" w:hAnsi="Arial" w:cs="Arial"/>
+        </w:rPr>
+        <w:t>Système d'exploitation : Windows 10/11 (avec droits administrateur pour Docker et Node.js).</w:t>
+      </w:r>
+    </w:p>
+    <w:p>
+      <w:pPr>
+        <w:pStyle w:val="Paragraphedeliste"/>
+        <w:numPr>
+          <w:ilvl w:val="0"/>
+          <w:numId w:val="6"/>
+        </w:numPr>
+        <w:rPr>
+          <w:rFonts w:ascii="Arial" w:hAnsi="Arial" w:cs="Arial"/>
+        </w:rPr>
+      </w:pPr>
+      <w:r>
+        <w:rPr>
+          <w:rFonts w:ascii="Arial" w:hAnsi="Arial" w:cs="Arial"/>
+        </w:rPr>
+        <w:t>Node.js : Version 20.x ou supérieure (LTS recommandée).</w:t>
+      </w:r>
+    </w:p>
+    <w:p>
+      <w:pPr>
+        <w:pStyle w:val="Paragraphedeliste"/>
+        <w:numPr>
+          <w:ilvl w:val="0"/>
+          <w:numId w:val="6"/>
+        </w:numPr>
+        <w:rPr>
+          <w:rFonts w:ascii="Arial" w:hAnsi="Arial" w:cs="Arial"/>
+        </w:rPr>
+      </w:pPr>
+      <w:r>
+        <w:rPr>
+          <w:rFonts w:ascii="Arial" w:hAnsi="Arial" w:cs="Arial"/>
+        </w:rPr>
+        <w:t xml:space="preserve">Gestionnaire de paquets : </w:t>
       </w:r>
       <w:proofErr w:type="spellStart"/>
       <w:r>
-        <w:t>bash</w:t>
+        <w:rPr>
+          <w:rFonts w:ascii="Arial" w:hAnsi="Arial" w:cs="Arial"/>
+        </w:rPr>
+        <w:t>npm</w:t>
       </w:r>
       <w:proofErr w:type="spellEnd"/>
       <w:r>
-        <w:t>. On lance la commande docker-compose up -d.</w:t>
-      </w:r>
-    </w:p>
-    <w:p/>
+        <w:rPr>
+          <w:rFonts w:ascii="Arial" w:hAnsi="Arial" w:cs="Arial"/>
+        </w:rPr>
+        <w:t xml:space="preserve"> (inclus avec Node.js).</w:t>
+      </w:r>
+    </w:p>
+    <w:p>
+      <w:pPr>
+        <w:pStyle w:val="Paragraphedeliste"/>
+        <w:numPr>
+          <w:ilvl w:val="0"/>
+          <w:numId w:val="6"/>
+        </w:numPr>
+        <w:rPr>
+          <w:rFonts w:ascii="Arial" w:hAnsi="Arial" w:cs="Arial"/>
+        </w:rPr>
+      </w:pPr>
+      <w:r>
+        <w:rPr>
+          <w:rFonts w:ascii="Arial" w:hAnsi="Arial" w:cs="Arial"/>
+        </w:rPr>
+        <w:t>Docker Desktop : Nécessaire pour l'instance MySQL.</w:t>
+      </w:r>
+    </w:p>
+    <w:p>
+      <w:pPr>
+        <w:pStyle w:val="Paragraphedeliste"/>
+        <w:numPr>
+          <w:ilvl w:val="0"/>
+          <w:numId w:val="6"/>
+        </w:numPr>
+        <w:rPr>
+          <w:rFonts w:ascii="Arial" w:hAnsi="Arial" w:cs="Arial"/>
+        </w:rPr>
+      </w:pPr>
+      <w:r>
+        <w:rPr>
+          <w:rFonts w:ascii="Arial" w:hAnsi="Arial" w:cs="Arial"/>
+        </w:rPr>
+        <w:t>Navigateur : Chrome, Firefox ou Edge à jour.</w:t>
+      </w:r>
+    </w:p>
+    <w:p>
+      <w:pPr>
+        <w:ind w:left="360"/>
+        <w:rPr>
+          <w:rFonts w:ascii="Arial" w:hAnsi="Arial" w:cs="Arial"/>
+        </w:rPr>
+      </w:pPr>
+    </w:p>
     <w:p>
       <w:pPr>
         <w:pStyle w:val="Titre2"/>
         <w:numPr>
           <w:ilvl w:val="0"/>
-          <w:numId w:val="2"/>
+          <w:numId w:val="5"/>
         </w:numPr>
-      </w:pPr>
-      <w:r>
-        <w:t>Configuration du backend</w:t>
-      </w:r>
-    </w:p>
-    <w:p>
-      <w:r>
-        <w:t xml:space="preserve">Pour la mise en route, on doit créer </w:t>
-      </w:r>
-      <w:proofErr w:type="gramStart"/>
-      <w:r>
-        <w:t>le .</w:t>
-      </w:r>
-      <w:proofErr w:type="spellStart"/>
-      <w:r>
-        <w:t>env</w:t>
-      </w:r>
-      <w:proofErr w:type="spellEnd"/>
-      <w:proofErr w:type="gramEnd"/>
-      <w:r>
-        <w:t xml:space="preserve"> à partir du .</w:t>
-      </w:r>
-      <w:proofErr w:type="spellStart"/>
-      <w:r>
-        <w:t>env.example</w:t>
-      </w:r>
-      <w:proofErr w:type="spellEnd"/>
-      <w:r>
-        <w:t xml:space="preserve"> dans l’application sur </w:t>
-      </w:r>
-      <w:proofErr w:type="spellStart"/>
-      <w:r>
-        <w:t>VSCode</w:t>
-      </w:r>
-      <w:proofErr w:type="spellEnd"/>
-      <w:r>
-        <w:t xml:space="preserve">. Dans </w:t>
-      </w:r>
-      <w:proofErr w:type="gramStart"/>
-      <w:r>
-        <w:t>ce .</w:t>
-      </w:r>
-      <w:proofErr w:type="spellStart"/>
-      <w:r>
-        <w:t>env</w:t>
-      </w:r>
-      <w:proofErr w:type="spellEnd"/>
-      <w:proofErr w:type="gramEnd"/>
-      <w:r>
-        <w:t>, on doit :</w:t>
+        <w:rPr>
+          <w:rFonts w:ascii="Arial" w:hAnsi="Arial" w:cs="Arial"/>
+        </w:rPr>
+      </w:pPr>
+      <w:r>
+        <w:rPr>
+          <w:rFonts w:ascii="Arial" w:hAnsi="Arial" w:cs="Arial"/>
+        </w:rPr>
+        <w:t>Infrastructure de base de données (Docker)</w:t>
+      </w:r>
+    </w:p>
+    <w:p>
+      <w:pPr>
+        <w:rPr>
+          <w:rFonts w:ascii="Arial" w:hAnsi="Arial" w:cs="Arial"/>
+        </w:rPr>
+      </w:pPr>
+      <w:r>
+        <w:rPr>
+          <w:rFonts w:ascii="Arial" w:hAnsi="Arial" w:cs="Arial"/>
+        </w:rPr>
+        <w:t>L’application utilise Docker pour isoler la base de données MySQL.</w:t>
       </w:r>
     </w:p>
     <w:p>
@@ -114,32 +465,17 @@
         <w:pStyle w:val="Paragraphedeliste"/>
         <w:numPr>
           <w:ilvl w:val="0"/>
-          <w:numId w:val="3"/>
+          <w:numId w:val="7"/>
         </w:numPr>
-      </w:pPr>
-      <w:proofErr w:type="gramStart"/>
-      <w:r>
-        <w:t>générer</w:t>
-      </w:r>
-      <w:proofErr w:type="gramEnd"/>
-      <w:r>
-        <w:t xml:space="preserve"> l’app key avec la commande </w:t>
-      </w:r>
-      <w:proofErr w:type="spellStart"/>
-      <w:r>
-        <w:t>node</w:t>
-      </w:r>
-      <w:proofErr w:type="spellEnd"/>
-      <w:r>
-        <w:t xml:space="preserve"> ace </w:t>
-      </w:r>
-      <w:proofErr w:type="spellStart"/>
-      <w:r>
-        <w:t>generate:key</w:t>
-      </w:r>
-      <w:proofErr w:type="spellEnd"/>
-      <w:r>
-        <w:t>,</w:t>
+        <w:rPr>
+          <w:rFonts w:ascii="Arial" w:hAnsi="Arial" w:cs="Arial"/>
+        </w:rPr>
+      </w:pPr>
+      <w:r>
+        <w:rPr>
+          <w:rFonts w:ascii="Arial" w:hAnsi="Arial" w:cs="Arial"/>
+        </w:rPr>
+        <w:t>Vérification : S'assurer que Docker Desktop est lancé avec les droits requis.</w:t>
       </w:r>
     </w:p>
     <w:p>
@@ -147,16 +483,31 @@
         <w:pStyle w:val="Paragraphedeliste"/>
         <w:numPr>
           <w:ilvl w:val="0"/>
-          <w:numId w:val="3"/>
+          <w:numId w:val="7"/>
         </w:numPr>
-      </w:pPr>
-      <w:proofErr w:type="gramStart"/>
-      <w:r>
-        <w:t>mettre</w:t>
-      </w:r>
-      <w:proofErr w:type="gramEnd"/>
-      <w:r>
-        <w:t xml:space="preserve"> le DB_PORT à 6033,</w:t>
+        <w:rPr>
+          <w:rFonts w:ascii="Arial" w:hAnsi="Arial" w:cs="Arial"/>
+        </w:rPr>
+      </w:pPr>
+      <w:r>
+        <w:rPr>
+          <w:rFonts w:ascii="Arial" w:hAnsi="Arial" w:cs="Arial"/>
+        </w:rPr>
+        <w:t>Lancement : Ouvrir un terminal dans le répertoire racine du projet (où se trouve docker-</w:t>
+      </w:r>
+      <w:proofErr w:type="spellStart"/>
+      <w:r>
+        <w:rPr>
+          <w:rFonts w:ascii="Arial" w:hAnsi="Arial" w:cs="Arial"/>
+        </w:rPr>
+        <w:t>compose.yml</w:t>
+      </w:r>
+      <w:proofErr w:type="spellEnd"/>
+      <w:r>
+        <w:rPr>
+          <w:rFonts w:ascii="Arial" w:hAnsi="Arial" w:cs="Arial"/>
+        </w:rPr>
+        <w:t>).</w:t>
       </w:r>
     </w:p>
     <w:p>
@@ -164,107 +515,917 @@
         <w:pStyle w:val="Paragraphedeliste"/>
         <w:numPr>
           <w:ilvl w:val="0"/>
-          <w:numId w:val="3"/>
+          <w:numId w:val="7"/>
         </w:numPr>
-      </w:pPr>
-      <w:proofErr w:type="gramStart"/>
-      <w:r>
-        <w:t>mettre</w:t>
-      </w:r>
-      <w:proofErr w:type="gramEnd"/>
-      <w:r>
-        <w:t xml:space="preserve"> DB_PASSWORD à root.</w:t>
-      </w:r>
-    </w:p>
-    <w:p>
-      <w:r>
-        <w:t xml:space="preserve">Ensuite, on se place dans le dossier backend et on lancer la commande </w:t>
-      </w:r>
-      <w:proofErr w:type="spellStart"/>
-      <w:r>
-        <w:t>npm</w:t>
-      </w:r>
-      <w:proofErr w:type="spellEnd"/>
-      <w:r>
-        <w:t xml:space="preserve"> </w:t>
-      </w:r>
-      <w:proofErr w:type="spellStart"/>
-      <w:r>
-        <w:t>install</w:t>
-      </w:r>
-      <w:proofErr w:type="spellEnd"/>
-      <w:r>
-        <w:t xml:space="preserve"> afin d’installer les dépendances.</w:t>
-      </w:r>
-    </w:p>
-    <w:p/>
+        <w:rPr>
+          <w:rFonts w:ascii="Arial" w:hAnsi="Arial" w:cs="Arial"/>
+        </w:rPr>
+      </w:pPr>
+      <w:r>
+        <w:rPr>
+          <w:rFonts w:ascii="Arial" w:hAnsi="Arial" w:cs="Arial"/>
+        </w:rPr>
+        <w:t>Commande : Exécuter docker-compose up -d pour lancer le conteneur en arrière-plan.</w:t>
+      </w:r>
+    </w:p>
+    <w:p>
+      <w:pPr>
+        <w:ind w:left="708" w:firstLine="708"/>
+        <w:rPr>
+          <w:rFonts w:ascii="Arial" w:hAnsi="Arial" w:cs="Arial"/>
+        </w:rPr>
+      </w:pPr>
+      <w:r>
+        <w:rPr>
+          <w:rFonts w:ascii="Arial" w:hAnsi="Arial" w:cs="Arial"/>
+          <w:i/>
+          <w:iCs/>
+        </w:rPr>
+        <w:t>Note :</w:t>
+      </w:r>
+      <w:r>
+        <w:rPr>
+          <w:rFonts w:ascii="Arial" w:hAnsi="Arial" w:cs="Arial"/>
+        </w:rPr>
+        <w:t xml:space="preserve"> Si le port par défaut est occupé, Docker utilisera le mappage défini (6033).</w:t>
+      </w:r>
+    </w:p>
     <w:p>
       <w:pPr>
         <w:pStyle w:val="Titre2"/>
         <w:numPr>
           <w:ilvl w:val="0"/>
-          <w:numId w:val="2"/>
+          <w:numId w:val="5"/>
         </w:numPr>
-      </w:pPr>
-      <w:r>
-        <w:t>Configuration du frontend</w:t>
-      </w:r>
-    </w:p>
-    <w:p>
-      <w:r>
-        <w:t xml:space="preserve">Pour la mise en place du frontend, on doit juste se mettre dans le dossier frontend et lancer la commande </w:t>
+        <w:rPr>
+          <w:rFonts w:ascii="Arial" w:hAnsi="Arial" w:cs="Arial"/>
+        </w:rPr>
+      </w:pPr>
+      <w:r>
+        <w:rPr>
+          <w:rFonts w:ascii="Arial" w:hAnsi="Arial" w:cs="Arial"/>
+        </w:rPr>
+        <w:t>Configuration et installation du Backend (</w:t>
       </w:r>
       <w:proofErr w:type="spellStart"/>
       <w:r>
+        <w:rPr>
+          <w:rFonts w:ascii="Arial" w:hAnsi="Arial" w:cs="Arial"/>
+        </w:rPr>
+        <w:t>AdonisJS</w:t>
+      </w:r>
+      <w:proofErr w:type="spellEnd"/>
+      <w:r>
+        <w:rPr>
+          <w:rFonts w:ascii="Arial" w:hAnsi="Arial" w:cs="Arial"/>
+        </w:rPr>
+        <w:t xml:space="preserve"> v6)</w:t>
+      </w:r>
+    </w:p>
+    <w:p>
+      <w:pPr>
+        <w:pStyle w:val="Paragraphedeliste"/>
+        <w:numPr>
+          <w:ilvl w:val="1"/>
+          <w:numId w:val="7"/>
+        </w:numPr>
+        <w:rPr>
+          <w:rFonts w:ascii="Arial" w:hAnsi="Arial" w:cs="Arial"/>
+        </w:rPr>
+      </w:pPr>
+      <w:r>
+        <w:rPr>
+          <w:rFonts w:ascii="Arial" w:hAnsi="Arial" w:cs="Arial"/>
+        </w:rPr>
+        <w:t xml:space="preserve">Dépendances : Se placer dans le dossier /backend et exécuter </w:t>
+      </w:r>
+      <w:proofErr w:type="spellStart"/>
+      <w:r>
+        <w:rPr>
+          <w:rFonts w:ascii="Arial" w:hAnsi="Arial" w:cs="Arial"/>
+        </w:rPr>
         <w:t>npm</w:t>
       </w:r>
       <w:proofErr w:type="spellEnd"/>
       <w:r>
+        <w:rPr>
+          <w:rFonts w:ascii="Arial" w:hAnsi="Arial" w:cs="Arial"/>
+        </w:rPr>
         <w:t xml:space="preserve"> </w:t>
       </w:r>
       <w:proofErr w:type="spellStart"/>
       <w:r>
+        <w:rPr>
+          <w:rFonts w:ascii="Arial" w:hAnsi="Arial" w:cs="Arial"/>
+        </w:rPr>
         <w:t>install</w:t>
       </w:r>
       <w:proofErr w:type="spellEnd"/>
       <w:r>
-        <w:t xml:space="preserve"> comme pour le backend.</w:t>
-      </w:r>
-    </w:p>
-    <w:p/>
+        <w:rPr>
+          <w:rFonts w:ascii="Arial" w:hAnsi="Arial" w:cs="Arial"/>
+        </w:rPr>
+        <w:t>.</w:t>
+      </w:r>
+    </w:p>
+    <w:p>
+      <w:pPr>
+        <w:pStyle w:val="Paragraphedeliste"/>
+        <w:numPr>
+          <w:ilvl w:val="1"/>
+          <w:numId w:val="7"/>
+        </w:numPr>
+        <w:rPr>
+          <w:rFonts w:ascii="Arial" w:hAnsi="Arial" w:cs="Arial"/>
+        </w:rPr>
+      </w:pPr>
+      <w:r>
+        <w:rPr>
+          <w:rFonts w:ascii="Arial" w:hAnsi="Arial" w:cs="Arial"/>
+        </w:rPr>
+        <w:t xml:space="preserve">Environnement : Créer le </w:t>
+      </w:r>
+      <w:proofErr w:type="gramStart"/>
+      <w:r>
+        <w:rPr>
+          <w:rFonts w:ascii="Arial" w:hAnsi="Arial" w:cs="Arial"/>
+        </w:rPr>
+        <w:t>fichier .</w:t>
+      </w:r>
+      <w:proofErr w:type="spellStart"/>
+      <w:r>
+        <w:rPr>
+          <w:rFonts w:ascii="Arial" w:hAnsi="Arial" w:cs="Arial"/>
+        </w:rPr>
+        <w:t>env</w:t>
+      </w:r>
+      <w:proofErr w:type="spellEnd"/>
+      <w:proofErr w:type="gramEnd"/>
+      <w:r>
+        <w:rPr>
+          <w:rFonts w:ascii="Arial" w:hAnsi="Arial" w:cs="Arial"/>
+        </w:rPr>
+        <w:t xml:space="preserve"> à partir du modèle .</w:t>
+      </w:r>
+      <w:proofErr w:type="spellStart"/>
+      <w:r>
+        <w:rPr>
+          <w:rFonts w:ascii="Arial" w:hAnsi="Arial" w:cs="Arial"/>
+        </w:rPr>
+        <w:t>env.example</w:t>
+      </w:r>
+      <w:proofErr w:type="spellEnd"/>
+      <w:r>
+        <w:rPr>
+          <w:rFonts w:ascii="Arial" w:hAnsi="Arial" w:cs="Arial"/>
+        </w:rPr>
+        <w:t>.</w:t>
+      </w:r>
+    </w:p>
+    <w:p>
+      <w:pPr>
+        <w:pStyle w:val="Paragraphedeliste"/>
+        <w:numPr>
+          <w:ilvl w:val="1"/>
+          <w:numId w:val="7"/>
+        </w:numPr>
+        <w:rPr>
+          <w:rFonts w:ascii="Arial" w:hAnsi="Arial" w:cs="Arial"/>
+        </w:rPr>
+      </w:pPr>
+      <w:r>
+        <w:rPr>
+          <w:rFonts w:ascii="Arial" w:hAnsi="Arial" w:cs="Arial"/>
+        </w:rPr>
+        <w:t xml:space="preserve">Paramétrage </w:t>
+      </w:r>
+      <w:proofErr w:type="gramStart"/>
+      <w:r>
+        <w:rPr>
+          <w:rFonts w:ascii="Arial" w:hAnsi="Arial" w:cs="Arial"/>
+        </w:rPr>
+        <w:t>du .</w:t>
+      </w:r>
+      <w:proofErr w:type="spellStart"/>
+      <w:r>
+        <w:rPr>
+          <w:rFonts w:ascii="Arial" w:hAnsi="Arial" w:cs="Arial"/>
+        </w:rPr>
+        <w:t>env</w:t>
+      </w:r>
+      <w:proofErr w:type="spellEnd"/>
+      <w:proofErr w:type="gramEnd"/>
+      <w:r>
+        <w:rPr>
+          <w:rFonts w:ascii="Arial" w:hAnsi="Arial" w:cs="Arial"/>
+        </w:rPr>
+        <w:t xml:space="preserve"> :</w:t>
+      </w:r>
+    </w:p>
+    <w:p>
+      <w:pPr>
+        <w:pStyle w:val="Paragraphedeliste"/>
+        <w:numPr>
+          <w:ilvl w:val="2"/>
+          <w:numId w:val="7"/>
+        </w:numPr>
+        <w:rPr>
+          <w:rFonts w:ascii="Arial" w:hAnsi="Arial" w:cs="Arial"/>
+        </w:rPr>
+      </w:pPr>
+      <w:r>
+        <w:rPr>
+          <w:rFonts w:ascii="Arial" w:hAnsi="Arial" w:cs="Arial"/>
+        </w:rPr>
+        <w:t xml:space="preserve">Générer la clé d'application : </w:t>
+      </w:r>
+      <w:proofErr w:type="spellStart"/>
+      <w:r>
+        <w:rPr>
+          <w:rFonts w:ascii="Arial" w:hAnsi="Arial" w:cs="Arial"/>
+        </w:rPr>
+        <w:t>node</w:t>
+      </w:r>
+      <w:proofErr w:type="spellEnd"/>
+      <w:r>
+        <w:rPr>
+          <w:rFonts w:ascii="Arial" w:hAnsi="Arial" w:cs="Arial"/>
+        </w:rPr>
+        <w:t xml:space="preserve"> ace </w:t>
+      </w:r>
+      <w:proofErr w:type="spellStart"/>
+      <w:proofErr w:type="gramStart"/>
+      <w:r>
+        <w:rPr>
+          <w:rFonts w:ascii="Arial" w:hAnsi="Arial" w:cs="Arial"/>
+        </w:rPr>
+        <w:t>generate:</w:t>
+      </w:r>
+      <w:proofErr w:type="gramEnd"/>
+      <w:r>
+        <w:rPr>
+          <w:rFonts w:ascii="Arial" w:hAnsi="Arial" w:cs="Arial"/>
+        </w:rPr>
+        <w:t>key</w:t>
+      </w:r>
+      <w:proofErr w:type="spellEnd"/>
+      <w:r>
+        <w:rPr>
+          <w:rFonts w:ascii="Arial" w:hAnsi="Arial" w:cs="Arial"/>
+        </w:rPr>
+        <w:t>.</w:t>
+      </w:r>
+    </w:p>
+    <w:p>
+      <w:pPr>
+        <w:pStyle w:val="Paragraphedeliste"/>
+        <w:numPr>
+          <w:ilvl w:val="2"/>
+          <w:numId w:val="7"/>
+        </w:numPr>
+        <w:rPr>
+          <w:rFonts w:ascii="Arial" w:hAnsi="Arial" w:cs="Arial"/>
+        </w:rPr>
+      </w:pPr>
+      <w:r>
+        <w:rPr>
+          <w:rFonts w:ascii="Arial" w:hAnsi="Arial" w:cs="Arial"/>
+        </w:rPr>
+        <w:t>Configurer l'accès DB : DB_PORT=6033 et DB_PASSWORD=root.</w:t>
+      </w:r>
+    </w:p>
+    <w:p>
+      <w:pPr>
+        <w:pStyle w:val="Paragraphedeliste"/>
+        <w:numPr>
+          <w:ilvl w:val="1"/>
+          <w:numId w:val="7"/>
+        </w:numPr>
+        <w:rPr>
+          <w:rFonts w:ascii="Arial" w:hAnsi="Arial" w:cs="Arial"/>
+        </w:rPr>
+      </w:pPr>
+      <w:r>
+        <w:rPr>
+          <w:rFonts w:ascii="Arial" w:hAnsi="Arial" w:cs="Arial"/>
+        </w:rPr>
+        <w:t xml:space="preserve">Initialisation DB (Migration) : Crucial pour créer les tables nécessaires, exécuter la commande </w:t>
+      </w:r>
+      <w:proofErr w:type="spellStart"/>
+      <w:r>
+        <w:rPr>
+          <w:rFonts w:ascii="Arial" w:hAnsi="Arial" w:cs="Arial"/>
+        </w:rPr>
+        <w:t>node</w:t>
+      </w:r>
+      <w:proofErr w:type="spellEnd"/>
+      <w:r>
+        <w:rPr>
+          <w:rFonts w:ascii="Arial" w:hAnsi="Arial" w:cs="Arial"/>
+        </w:rPr>
+        <w:t xml:space="preserve"> ace </w:t>
+      </w:r>
+      <w:proofErr w:type="spellStart"/>
+      <w:proofErr w:type="gramStart"/>
+      <w:r>
+        <w:rPr>
+          <w:rFonts w:ascii="Arial" w:hAnsi="Arial" w:cs="Arial"/>
+        </w:rPr>
+        <w:t>migration:run</w:t>
+      </w:r>
+      <w:proofErr w:type="spellEnd"/>
+      <w:proofErr w:type="gramEnd"/>
+      <w:r>
+        <w:rPr>
+          <w:rFonts w:ascii="Arial" w:hAnsi="Arial" w:cs="Arial"/>
+        </w:rPr>
+        <w:t>.</w:t>
+      </w:r>
+    </w:p>
+    <w:p>
+      <w:pPr>
+        <w:pStyle w:val="Titre2"/>
+        <w:rPr>
+          <w:rFonts w:ascii="Arial" w:hAnsi="Arial" w:cs="Arial"/>
+        </w:rPr>
+      </w:pPr>
+    </w:p>
     <w:p>
       <w:pPr>
         <w:pStyle w:val="Titre2"/>
         <w:numPr>
           <w:ilvl w:val="0"/>
-          <w:numId w:val="2"/>
+          <w:numId w:val="5"/>
         </w:numPr>
-      </w:pPr>
-      <w:r>
-        <w:t>Lancement de l’application</w:t>
-      </w:r>
-    </w:p>
-    <w:p>
-      <w:r>
-        <w:t xml:space="preserve">Pour lance l’application, on lance la commande </w:t>
+        <w:rPr>
+          <w:rFonts w:ascii="Arial" w:hAnsi="Arial" w:cs="Arial"/>
+        </w:rPr>
+      </w:pPr>
+      <w:r>
+        <w:rPr>
+          <w:rFonts w:ascii="Arial" w:hAnsi="Arial" w:cs="Arial"/>
+        </w:rPr>
+        <w:t>Configuration du Frontend (Vue 3 + Vite)</w:t>
+      </w:r>
+    </w:p>
+    <w:p>
+      <w:pPr>
+        <w:pStyle w:val="Paragraphedeliste"/>
+        <w:numPr>
+          <w:ilvl w:val="0"/>
+          <w:numId w:val="8"/>
+        </w:numPr>
+        <w:rPr>
+          <w:rFonts w:ascii="Arial" w:hAnsi="Arial" w:cs="Arial"/>
+        </w:rPr>
+      </w:pPr>
+      <w:r>
+        <w:rPr>
+          <w:rFonts w:ascii="Arial" w:hAnsi="Arial" w:cs="Arial"/>
+          <w:b/>
+          <w:bCs/>
+        </w:rPr>
+        <w:t>Installation :</w:t>
+      </w:r>
+      <w:r>
+        <w:rPr>
+          <w:rFonts w:ascii="Arial" w:hAnsi="Arial" w:cs="Arial"/>
+        </w:rPr>
+        <w:t xml:space="preserve"> Se placer dans le dossier /frontend et exécuter </w:t>
       </w:r>
       <w:proofErr w:type="spellStart"/>
       <w:r>
+        <w:rPr>
+          <w:rFonts w:ascii="Arial" w:hAnsi="Arial" w:cs="Arial"/>
+        </w:rPr>
         <w:t>npm</w:t>
       </w:r>
       <w:proofErr w:type="spellEnd"/>
       <w:r>
-        <w:t xml:space="preserve"> run dev dans les dossiers frontend et backend et on accède au lien localhost :5173. Si tout se passe bien, on doit voir cela :</w:t>
-      </w:r>
-    </w:p>
-    <w:p>
-      <w:r>
+        <w:rPr>
+          <w:rFonts w:ascii="Arial" w:hAnsi="Arial" w:cs="Arial"/>
+        </w:rPr>
+        <w:t xml:space="preserve"> </w:t>
+      </w:r>
+      <w:proofErr w:type="spellStart"/>
+      <w:r>
+        <w:rPr>
+          <w:rFonts w:ascii="Arial" w:hAnsi="Arial" w:cs="Arial"/>
+        </w:rPr>
+        <w:t>install</w:t>
+      </w:r>
+      <w:proofErr w:type="spellEnd"/>
+      <w:r>
+        <w:rPr>
+          <w:rFonts w:ascii="Arial" w:hAnsi="Arial" w:cs="Arial"/>
+        </w:rPr>
+        <w:t>.</w:t>
+      </w:r>
+    </w:p>
+    <w:p>
+      <w:pPr>
+        <w:pStyle w:val="Paragraphedeliste"/>
+        <w:numPr>
+          <w:ilvl w:val="0"/>
+          <w:numId w:val="8"/>
+        </w:numPr>
+        <w:rPr>
+          <w:rFonts w:ascii="Arial" w:hAnsi="Arial" w:cs="Arial"/>
+        </w:rPr>
+      </w:pPr>
+      <w:r>
+        <w:rPr>
+          <w:rFonts w:ascii="Arial" w:hAnsi="Arial" w:cs="Arial"/>
+          <w:b/>
+          <w:bCs/>
+        </w:rPr>
+        <w:t>Contexte :</w:t>
+      </w:r>
+      <w:r>
+        <w:rPr>
+          <w:rFonts w:ascii="Arial" w:hAnsi="Arial" w:cs="Arial"/>
+        </w:rPr>
+        <w:t xml:space="preserve"> Le frontend est configuré pour communiquer avec l'API via le préfixe /api sur le port local.</w:t>
+      </w:r>
+    </w:p>
+    <w:p>
+      <w:pPr>
+        <w:rPr>
+          <w:rFonts w:ascii="Arial" w:hAnsi="Arial" w:cs="Arial"/>
+        </w:rPr>
+      </w:pPr>
+    </w:p>
+    <w:p>
+      <w:pPr>
+        <w:pStyle w:val="Titre2"/>
+        <w:numPr>
+          <w:ilvl w:val="0"/>
+          <w:numId w:val="5"/>
+        </w:numPr>
+        <w:rPr>
+          <w:rFonts w:ascii="Arial" w:hAnsi="Arial" w:cs="Arial"/>
+        </w:rPr>
+      </w:pPr>
+      <w:r>
+        <w:rPr>
+          <w:rFonts w:ascii="Arial" w:hAnsi="Arial" w:cs="Arial"/>
+        </w:rPr>
         <w:lastRenderedPageBreak/>
+        <w:t>Lancement et vérification</w:t>
+      </w:r>
+    </w:p>
+    <w:p>
+      <w:pPr>
+        <w:pStyle w:val="Paragraphedeliste"/>
+        <w:numPr>
+          <w:ilvl w:val="0"/>
+          <w:numId w:val="9"/>
+        </w:numPr>
+        <w:rPr>
+          <w:rFonts w:ascii="Arial" w:hAnsi="Arial" w:cs="Arial"/>
+        </w:rPr>
+      </w:pPr>
+      <w:r>
+        <w:rPr>
+          <w:rFonts w:ascii="Arial" w:hAnsi="Arial" w:cs="Arial"/>
+          <w:b/>
+          <w:bCs/>
+        </w:rPr>
+        <w:t>Démarrage simultané :</w:t>
+      </w:r>
+      <w:r>
+        <w:rPr>
+          <w:rFonts w:ascii="Arial" w:hAnsi="Arial" w:cs="Arial"/>
+        </w:rPr>
+        <w:t xml:space="preserve"> Lancer </w:t>
+      </w:r>
+      <w:proofErr w:type="spellStart"/>
+      <w:r>
+        <w:rPr>
+          <w:rFonts w:ascii="Arial" w:hAnsi="Arial" w:cs="Arial"/>
+        </w:rPr>
+        <w:t>npm</w:t>
+      </w:r>
+      <w:proofErr w:type="spellEnd"/>
+      <w:r>
+        <w:rPr>
+          <w:rFonts w:ascii="Arial" w:hAnsi="Arial" w:cs="Arial"/>
+        </w:rPr>
+        <w:t xml:space="preserve"> run dev dans deux terminaux distincts (un pour le backend, un pour le frontend).</w:t>
+      </w:r>
+    </w:p>
+    <w:p>
+      <w:pPr>
+        <w:pStyle w:val="Paragraphedeliste"/>
+        <w:numPr>
+          <w:ilvl w:val="0"/>
+          <w:numId w:val="9"/>
+        </w:numPr>
+        <w:rPr>
+          <w:rFonts w:ascii="Arial" w:hAnsi="Arial" w:cs="Arial"/>
+        </w:rPr>
+      </w:pPr>
+      <w:r>
+        <w:rPr>
+          <w:rFonts w:ascii="Arial" w:hAnsi="Arial" w:cs="Arial"/>
+          <w:b/>
+          <w:bCs/>
+        </w:rPr>
+        <w:t>Accès :</w:t>
+      </w:r>
+      <w:r>
+        <w:rPr>
+          <w:rFonts w:ascii="Arial" w:hAnsi="Arial" w:cs="Arial"/>
+        </w:rPr>
+        <w:t xml:space="preserve"> Ouvrir le navigateur à l'adresse </w:t>
+      </w:r>
+      <w:hyperlink r:id="rId7" w:history="1">
+        <w:r>
+          <w:rPr>
+            <w:rStyle w:val="Lienhypertexte"/>
+            <w:rFonts w:ascii="Arial" w:hAnsi="Arial" w:cs="Arial"/>
+          </w:rPr>
+          <w:t>http://localhost:5173</w:t>
+        </w:r>
+      </w:hyperlink>
+      <w:r>
+        <w:rPr>
+          <w:rFonts w:ascii="Arial" w:hAnsi="Arial" w:cs="Arial"/>
+        </w:rPr>
+        <w:t>.</w:t>
+      </w:r>
+    </w:p>
+    <w:p>
+      <w:pPr>
+        <w:pStyle w:val="Paragraphedeliste"/>
+        <w:numPr>
+          <w:ilvl w:val="0"/>
+          <w:numId w:val="9"/>
+        </w:numPr>
+        <w:rPr>
+          <w:rFonts w:ascii="Arial" w:hAnsi="Arial" w:cs="Arial"/>
+        </w:rPr>
+      </w:pPr>
+      <w:r>
+        <w:rPr>
+          <w:rFonts w:ascii="Arial" w:hAnsi="Arial" w:cs="Arial"/>
+          <w:b/>
+          <w:bCs/>
+        </w:rPr>
+        <w:t>Preuve visuelle :</w:t>
+      </w:r>
+      <w:r>
+        <w:rPr>
+          <w:rFonts w:ascii="Arial" w:hAnsi="Arial" w:cs="Arial"/>
+        </w:rPr>
+        <w:t xml:space="preserve"> L'interface doit afficher "</w:t>
+      </w:r>
+      <w:proofErr w:type="spellStart"/>
+      <w:r>
+        <w:rPr>
+          <w:rFonts w:ascii="Arial" w:hAnsi="Arial" w:cs="Arial"/>
+        </w:rPr>
+        <w:t>TaskTimer</w:t>
+      </w:r>
+      <w:proofErr w:type="spellEnd"/>
+      <w:r>
+        <w:rPr>
+          <w:rFonts w:ascii="Arial" w:hAnsi="Arial" w:cs="Arial"/>
+        </w:rPr>
+        <w:t>" et permettre de cliquer sur "Afficher les taches".</w:t>
+      </w:r>
+    </w:p>
+    <w:p>
+      <w:pPr>
+        <w:pStyle w:val="Titre2"/>
+        <w:rPr>
+          <w:rFonts w:ascii="Arial" w:hAnsi="Arial" w:cs="Arial"/>
+        </w:rPr>
+      </w:pPr>
+    </w:p>
+    <w:p>
+      <w:pPr>
+        <w:pStyle w:val="Titre2"/>
+        <w:numPr>
+          <w:ilvl w:val="0"/>
+          <w:numId w:val="5"/>
+        </w:numPr>
+        <w:rPr>
+          <w:rFonts w:ascii="Arial" w:hAnsi="Arial" w:cs="Arial"/>
+        </w:rPr>
+      </w:pPr>
+      <w:r>
+        <w:rPr>
+          <w:rFonts w:ascii="Arial" w:hAnsi="Arial" w:cs="Arial"/>
+        </w:rPr>
+        <w:t>Journal des incidents et solutions</w:t>
+      </w:r>
+    </w:p>
+    <w:p>
+      <w:pPr>
+        <w:rPr>
+          <w:rFonts w:ascii="Arial" w:hAnsi="Arial" w:cs="Arial"/>
+        </w:rPr>
+      </w:pPr>
+      <w:r>
+        <w:rPr>
+          <w:rFonts w:ascii="Arial" w:hAnsi="Arial" w:cs="Arial"/>
+        </w:rPr>
+        <w:t>Pour assurer la portabilité du projet sur n'importe quel poste élève, voici les solutions aux problèmes anticipés :</w:t>
+      </w:r>
+    </w:p>
+    <w:p>
+      <w:pPr>
+        <w:pStyle w:val="Paragraphedeliste"/>
+        <w:numPr>
+          <w:ilvl w:val="0"/>
+          <w:numId w:val="10"/>
+        </w:numPr>
+        <w:rPr>
+          <w:rFonts w:ascii="Arial" w:hAnsi="Arial" w:cs="Arial"/>
+        </w:rPr>
+      </w:pPr>
+      <w:r>
+        <w:rPr>
+          <w:rFonts w:ascii="Arial" w:hAnsi="Arial" w:cs="Arial"/>
+          <w:b/>
+          <w:bCs/>
+        </w:rPr>
+        <w:t>Droits Administrateur :</w:t>
+      </w:r>
+      <w:r>
+        <w:rPr>
+          <w:rFonts w:ascii="Arial" w:hAnsi="Arial" w:cs="Arial"/>
+        </w:rPr>
+        <w:t xml:space="preserve"> Si Docker Desktop refuse de se lancer sur un poste école, vérifiez les autorisations système ou contactez le support technique.</w:t>
+      </w:r>
+    </w:p>
+    <w:p>
+      <w:pPr>
+        <w:pStyle w:val="Paragraphedeliste"/>
+        <w:numPr>
+          <w:ilvl w:val="0"/>
+          <w:numId w:val="10"/>
+        </w:numPr>
+        <w:rPr>
+          <w:rFonts w:ascii="Arial" w:hAnsi="Arial" w:cs="Arial"/>
+        </w:rPr>
+      </w:pPr>
+      <w:r>
+        <w:rPr>
+          <w:rFonts w:ascii="Arial" w:hAnsi="Arial" w:cs="Arial"/>
+          <w:b/>
+          <w:bCs/>
+        </w:rPr>
+        <w:t>Conflit de Ports :</w:t>
+      </w:r>
+      <w:r>
+        <w:rPr>
+          <w:rFonts w:ascii="Arial" w:hAnsi="Arial" w:cs="Arial"/>
+        </w:rPr>
+        <w:t xml:space="preserve"> Si le port 5173 est déjà utilisé, Vite en choisira un autre (</w:t>
+      </w:r>
+      <w:proofErr w:type="gramStart"/>
+      <w:r>
+        <w:rPr>
+          <w:rFonts w:ascii="Arial" w:hAnsi="Arial" w:cs="Arial"/>
+        </w:rPr>
+        <w:t>ex:</w:t>
+      </w:r>
+      <w:proofErr w:type="gramEnd"/>
+      <w:r>
+        <w:rPr>
+          <w:rFonts w:ascii="Arial" w:hAnsi="Arial" w:cs="Arial"/>
+        </w:rPr>
+        <w:t xml:space="preserve"> 5174). L'URL d'accès devra alors être adaptée.</w:t>
+      </w:r>
+    </w:p>
+    <w:p>
+      <w:pPr>
+        <w:pStyle w:val="Paragraphedeliste"/>
+        <w:numPr>
+          <w:ilvl w:val="0"/>
+          <w:numId w:val="10"/>
+        </w:numPr>
+        <w:rPr>
+          <w:rFonts w:ascii="Arial" w:hAnsi="Arial" w:cs="Arial"/>
+        </w:rPr>
+      </w:pPr>
+      <w:r>
+        <w:rPr>
+          <w:rFonts w:ascii="Arial" w:hAnsi="Arial" w:cs="Arial"/>
+          <w:b/>
+          <w:bCs/>
+        </w:rPr>
+        <w:t>Erreur de Connexion DB :</w:t>
+      </w:r>
+      <w:r>
+        <w:rPr>
+          <w:rFonts w:ascii="Arial" w:hAnsi="Arial" w:cs="Arial"/>
+        </w:rPr>
+        <w:t xml:space="preserve"> Si le backend affiche une erreur de connexion, vérifiez que le conteneur Docker est bien à l'état "Running" et que le DB_PORT dans </w:t>
+      </w:r>
+      <w:proofErr w:type="gramStart"/>
+      <w:r>
+        <w:rPr>
+          <w:rFonts w:ascii="Arial" w:hAnsi="Arial" w:cs="Arial"/>
+        </w:rPr>
+        <w:t>le .</w:t>
+      </w:r>
+      <w:proofErr w:type="spellStart"/>
+      <w:r>
+        <w:rPr>
+          <w:rFonts w:ascii="Arial" w:hAnsi="Arial" w:cs="Arial"/>
+        </w:rPr>
+        <w:t>env</w:t>
+      </w:r>
+      <w:proofErr w:type="spellEnd"/>
+      <w:proofErr w:type="gramEnd"/>
+      <w:r>
+        <w:rPr>
+          <w:rFonts w:ascii="Arial" w:hAnsi="Arial" w:cs="Arial"/>
+        </w:rPr>
+        <w:t xml:space="preserve"> correspond au port exposé par Docker (6033).</w:t>
+      </w:r>
+    </w:p>
+    <w:p>
+      <w:pPr>
+        <w:rPr>
+          <w:rFonts w:ascii="Arial" w:hAnsi="Arial" w:cs="Arial"/>
+        </w:rPr>
+      </w:pPr>
+    </w:p>
+    <w:p>
+      <w:pPr>
+        <w:ind w:left="360"/>
+        <w:rPr>
+          <w:rFonts w:ascii="Arial" w:hAnsi="Arial" w:cs="Arial"/>
+        </w:rPr>
+      </w:pPr>
+      <w:r>
+        <w:rPr>
+          <w:rFonts w:ascii="Arial" w:hAnsi="Arial" w:cs="Arial"/>
+          <w:noProof/>
+        </w:rPr>
+        <mc:AlternateContent>
+          <mc:Choice Requires="wps">
+            <w:drawing>
+              <wp:anchor distT="0" distB="0" distL="114300" distR="114300" simplePos="0" relativeHeight="251660288" behindDoc="1" locked="0" layoutInCell="1" allowOverlap="1" wp14:anchorId="41D92D62" wp14:editId="177C951E">
+                <wp:simplePos x="0" y="0"/>
+                <wp:positionH relativeFrom="column">
+                  <wp:posOffset>314325</wp:posOffset>
+                </wp:positionH>
+                <wp:positionV relativeFrom="paragraph">
+                  <wp:posOffset>3918585</wp:posOffset>
+                </wp:positionV>
+                <wp:extent cx="4886960" cy="635"/>
+                <wp:effectExtent l="0" t="0" r="0" b="0"/>
+                <wp:wrapTight wrapText="bothSides">
+                  <wp:wrapPolygon edited="0">
+                    <wp:start x="0" y="0"/>
+                    <wp:lineTo x="0" y="21600"/>
+                    <wp:lineTo x="21600" y="21600"/>
+                    <wp:lineTo x="21600" y="0"/>
+                  </wp:wrapPolygon>
+                </wp:wrapTight>
+                <wp:docPr id="1694477071" name="Zone de texte 1"/>
+                <wp:cNvGraphicFramePr/>
+                <a:graphic xmlns:a="http://schemas.openxmlformats.org/drawingml/2006/main">
+                  <a:graphicData uri="http://schemas.microsoft.com/office/word/2010/wordprocessingShape">
+                    <wps:wsp>
+                      <wps:cNvSpPr txBox="1"/>
+                      <wps:spPr>
+                        <a:xfrm>
+                          <a:off x="0" y="0"/>
+                          <a:ext cx="4886960" cy="635"/>
+                        </a:xfrm>
+                        <a:prstGeom prst="rect">
+                          <a:avLst/>
+                        </a:prstGeom>
+                        <a:solidFill>
+                          <a:prstClr val="white"/>
+                        </a:solidFill>
+                        <a:ln>
+                          <a:noFill/>
+                        </a:ln>
+                      </wps:spPr>
+                      <wps:txbx>
+                        <w:txbxContent>
+                          <w:p>
+                            <w:pPr>
+                              <w:pStyle w:val="Lgende"/>
+                            </w:pPr>
+                            <w:r>
+                              <w:t xml:space="preserve">Figure </w:t>
+                            </w:r>
+                            <w:r>
+                              <w:fldChar w:fldCharType="begin"/>
+                            </w:r>
+                            <w:r>
+                              <w:instrText xml:space="preserve"> SEQ Figure \* ARABIC </w:instrText>
+                            </w:r>
+                            <w:r>
+                              <w:fldChar w:fldCharType="separate"/>
+                            </w:r>
+                            <w:r>
+                              <w:rPr>
+                                <w:noProof/>
+                              </w:rPr>
+                              <w:t>1</w:t>
+                            </w:r>
+                            <w:r>
+                              <w:fldChar w:fldCharType="end"/>
+                            </w:r>
+                            <w:r>
+                              <w:t xml:space="preserve"> - Application lancée sur Chrome</w:t>
+                            </w:r>
+                          </w:p>
+                        </w:txbxContent>
+                      </wps:txbx>
+                      <wps:bodyPr rot="0" spcFirstLastPara="0" vertOverflow="overflow" horzOverflow="overflow" vert="horz" wrap="square" lIns="0" tIns="0" rIns="0" bIns="0" numCol="1" spcCol="0" rtlCol="0" fromWordArt="0" anchor="t" anchorCtr="0" forceAA="0" compatLnSpc="1">
+                        <a:prstTxWarp prst="textNoShape">
+                          <a:avLst/>
+                        </a:prstTxWarp>
+                        <a:spAutoFit/>
+                      </wps:bodyPr>
+                    </wps:wsp>
+                  </a:graphicData>
+                </a:graphic>
+              </wp:anchor>
+            </w:drawing>
+          </mc:Choice>
+          <mc:Fallback>
+            <w:pict>
+              <v:shapetype w14:anchorId="41D92D62" id="_x0000_t202" coordsize="21600,21600" o:spt="202" path="m,l,21600r21600,l21600,xe">
+                <v:stroke joinstyle="miter"/>
+                <v:path gradientshapeok="t" o:connecttype="rect"/>
+              </v:shapetype>
+              <v:shape id="Zone de texte 1" o:spid="_x0000_s1026" type="#_x0000_t202" style="position:absolute;left:0;text-align:left;margin-left:24.75pt;margin-top:308.55pt;width:384.8pt;height:.05pt;z-index:-251656192;visibility:visible;mso-wrap-style:square;mso-wrap-distance-left:9pt;mso-wrap-distance-top:0;mso-wrap-distance-right:9pt;mso-wrap-distance-bottom:0;mso-position-horizontal:absolute;mso-position-horizontal-relative:text;mso-position-vertical:absolute;mso-position-vertical-relative:text;v-text-anchor:top" o:gfxdata="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" stroked="f">
+                <v:textbox style="mso-fit-shape-to-text:t" inset="0,0,0,0">
+                  <w:txbxContent>
+                    <w:p>
+                      <w:pPr>
+                        <w:pStyle w:val="Lgende"/>
+                      </w:pPr>
+                      <w:r>
+                        <w:t xml:space="preserve">Figure </w:t>
+                      </w:r>
+                      <w:r>
+                        <w:fldChar w:fldCharType="begin"/>
+                      </w:r>
+                      <w:r>
+                        <w:instrText xml:space="preserve"> SEQ Figure \* ARABIC </w:instrText>
+                      </w:r>
+                      <w:r>
+                        <w:fldChar w:fldCharType="separate"/>
+                      </w:r>
+                      <w:r>
+                        <w:rPr>
+                          <w:noProof/>
+                        </w:rPr>
+                        <w:t>1</w:t>
+                      </w:r>
+                      <w:r>
+                        <w:fldChar w:fldCharType="end"/>
+                      </w:r>
+                      <w:r>
+                        <w:t xml:space="preserve"> - Application lancée sur Chrome</w:t>
+                      </w:r>
+                    </w:p>
+                  </w:txbxContent>
+                </v:textbox>
+                <w10:wrap type="tight"/>
+              </v:shape>
+            </w:pict>
+          </mc:Fallback>
+        </mc:AlternateContent>
+      </w:r>
+      <w:r>
+        <w:rPr>
+          <w:rFonts w:ascii="Arial" w:hAnsi="Arial" w:cs="Arial"/>
+          <w:noProof/>
+        </w:rPr>
         <w:drawing>
-          <wp:inline distT="0" distB="0" distL="0" distR="0" wp14:anchorId="770529D0" wp14:editId="18BA6896">
-            <wp:extent cx="5019675" cy="3031614"/>
-            <wp:effectExtent l="0" t="0" r="0" b="0"/>
-            <wp:docPr id="1459338414" name="Image 1"/>
+          <wp:anchor distT="0" distB="0" distL="114300" distR="114300" simplePos="0" relativeHeight="251658240" behindDoc="1" locked="0" layoutInCell="1" allowOverlap="1" wp14:anchorId="1DA2E2B0" wp14:editId="612F1125">
+            <wp:simplePos x="0" y="0"/>
+            <wp:positionH relativeFrom="margin">
+              <wp:posOffset>314325</wp:posOffset>
+            </wp:positionH>
+            <wp:positionV relativeFrom="paragraph">
+              <wp:posOffset>654050</wp:posOffset>
+            </wp:positionV>
+            <wp:extent cx="4886960" cy="3514725"/>
+            <wp:effectExtent l="0" t="0" r="8890" b="9525"/>
+            <wp:wrapTight wrapText="bothSides">
+              <wp:wrapPolygon edited="0">
+                <wp:start x="0" y="0"/>
+                <wp:lineTo x="0" y="21541"/>
+                <wp:lineTo x="21555" y="21541"/>
+                <wp:lineTo x="21555" y="0"/>
+                <wp:lineTo x="0" y="0"/>
+              </wp:wrapPolygon>
+            </wp:wrapTight>
+            <wp:docPr id="48626036" name="Image 1"/>
             <wp:cNvGraphicFramePr>
               <a:graphicFrameLocks xmlns:a="http://schemas.openxmlformats.org/drawingml/2006/main" noChangeAspect="1"/>
             </wp:cNvGraphicFramePr>
@@ -272,11 +1433,11 @@
               <a:graphicData uri="http://schemas.openxmlformats.org/drawingml/2006/picture">
                 <pic:pic xmlns:pic="http://schemas.openxmlformats.org/drawingml/2006/picture">
                   <pic:nvPicPr>
-                    <pic:cNvPr id="1459338414" name=""/>
+                    <pic:cNvPr id="48626036" name=""/>
                     <pic:cNvPicPr/>
                   </pic:nvPicPr>
                   <pic:blipFill>
-                    <a:blip r:embed="rId5">
+                    <a:blip r:embed="rId8">
                       <a:extLst>
                         <a:ext uri="{28A0092B-C50C-407E-A947-70E740481C1C}">
                           <a14:useLocalDpi xmlns:a14="http://schemas.microsoft.com/office/drawing/2010/main" val="0"/>
@@ -290,7 +1451,7 @@
                   <pic:spPr>
                     <a:xfrm>
                       <a:off x="0" y="0"/>
-                      <a:ext cx="5022412" cy="3033267"/>
+                      <a:ext cx="4886960" cy="3514725"/>
                     </a:xfrm>
                     <a:prstGeom prst="rect">
                       <a:avLst/>
@@ -299,8 +1460,20 @@
                 </pic:pic>
               </a:graphicData>
             </a:graphic>
-          </wp:inline>
+            <wp14:sizeRelH relativeFrom="margin">
+              <wp14:pctWidth>0</wp14:pctWidth>
+            </wp14:sizeRelH>
+            <wp14:sizeRelV relativeFrom="margin">
+              <wp14:pctHeight>0</wp14:pctHeight>
+            </wp14:sizeRelV>
+          </wp:anchor>
         </w:drawing>
+      </w:r>
+      <w:r>
+        <w:rPr>
+          <w:rFonts w:ascii="Arial" w:hAnsi="Arial" w:cs="Arial"/>
+        </w:rPr>
+        <w:t>Résultat après lancement de l’application :</w:t>
       </w:r>
     </w:p>
     <w:sectPr>
@@ -313,9 +1486,261 @@
 </w:document>
 </file>
 
+<file path=word/endnotes.xml><?xml version="1.0" encoding="utf-8"?>
+<w:endnotes xmlns:wpc="http://schemas.microsoft.com/office/word/2010/wordprocessingCanvas" xmlns:cx="http://schemas.microsoft.com/office/drawing/2014/chartex" xmlns:cx1="http://schemas.microsoft.com/office/drawing/2015/9/8/chartex" xmlns:cx2="http://schemas.microsoft.com/office/drawing/2015/10/21/chartex" xmlns:cx3="http://schemas.microsoft.com/office/drawing/2016/5/9/chartex" xmlns:cx4="http://schemas.microsoft.com/office/drawing/2016/5/10/chartex" xmlns:cx5="http://schemas.microsoft.com/office/drawing/2016/5/11/chartex" xmlns:cx6="http://schemas.microsoft.com/office/drawing/2016/5/12/chartex" xmlns:cx7="http://schemas.microsoft.com/office/drawing/2016/5/13/chartex" xmlns:cx8="http://schemas.microsoft.com/office/drawing/2016/5/14/chartex" xmlns:mc="http://schemas.openxmlformats.org/markup-compatibility/2006" xmlns:aink="http://schemas.microsoft.com/office/drawing/2016/ink" xmlns:am3d="http://schemas.microsoft.com/office/drawing/2017/model3d" xmlns:o="urn:schemas-microsoft-com:office:office" xmlns:oel="http://schemas.microsoft.com/office/2019/extlst" xmlns:r="http://schemas.openxmlformats.org/officeDocument/2006/relationships" xmlns:m="http://schemas.openxmlformats.org/officeDocument/2006/math" xmlns:v="urn:schemas-microsoft-com:vml" xmlns:wp14="http://schemas.microsoft.com/office/word/2010/wordprocessingDrawing" xmlns:wp="http://schemas.openxmlformats.org/drawingml/2006/wordprocessingDrawing" xmlns:w10="urn:schemas-microsoft-com:office:word" xmlns:w="http://schemas.openxmlformats.org/wordprocessingml/2006/main" xmlns:w14="http://schemas.microsoft.com/office/word/2010/wordml" xmlns:w15="http://schemas.microsoft.com/office/word/2012/wordml" xmlns:w16cex="http://schemas.microsoft.com/office/word/2018/wordml/cex" xmlns:w16cid="http://schemas.microsoft.com/office/word/2016/wordml/cid" xmlns:w16="http://schemas.microsoft.com/office/word/2018/wordml" xmlns:w16sdtdh="http://schemas.microsoft.com/office/word/2020/wordml/sdtdatahash" xmlns:w16se="http://schemas.microsoft.com/office/word/2015/wordml/symex" xmlns:wpg="http://schemas.microsoft.com/office/word/2010/wordprocessingGroup" xmlns:wpi="http://schemas.microsoft.com/office/word/2010/wordprocessingInk" xmlns:wne="http://schemas.microsoft.com/office/word/2006/wordml" xmlns:wps="http://schemas.microsoft.com/office/word/2010/wordprocessingShape" mc:Ignorable="w14 w15 w16se w16cid w16 w16cex w16sdtdh wp14">
+  <w:endnote w:type="separator" w:id="-1">
+    <w:p>
+      <w:pPr>
+        <w:spacing w:after="0" w:line="240" w:lineRule="auto"/>
+      </w:pPr>
+      <w:r>
+        <w:separator/>
+      </w:r>
+    </w:p>
+  </w:endnote>
+  <w:endnote w:type="continuationSeparator" w:id="0">
+    <w:p>
+      <w:pPr>
+        <w:spacing w:after="0" w:line="240" w:lineRule="auto"/>
+      </w:pPr>
+      <w:r>
+        <w:continuationSeparator/>
+      </w:r>
+    </w:p>
+  </w:endnote>
+</w:endnotes>
+</file>
+
+<file path=word/footnotes.xml><?xml version="1.0" encoding="utf-8"?>
+<w:footnotes xmlns:wpc="http://schemas.microsoft.com/office/word/2010/wordprocessingCanvas" xmlns:cx="http://schemas.microsoft.com/office/drawing/2014/chartex" xmlns:cx1="http://schemas.microsoft.com/office/drawing/2015/9/8/chartex" xmlns:cx2="http://schemas.microsoft.com/office/drawing/2015/10/21/chartex" xmlns:cx3="http://schemas.microsoft.com/office/drawing/2016/5/9/chartex" xmlns:cx4="http://schemas.microsoft.com/office/drawing/2016/5/10/chartex" xmlns:cx5="http://schemas.microsoft.com/office/drawing/2016/5/11/chartex" xmlns:cx6="http://schemas.microsoft.com/office/drawing/2016/5/12/chartex" xmlns:cx7="http://schemas.microsoft.com/office/drawing/2016/5/13/chartex" xmlns:cx8="http://schemas.microsoft.com/office/drawing/2016/5/14/chartex" xmlns:mc="http://schemas.openxmlformats.org/markup-compatibility/2006" xmlns:aink="http://schemas.microsoft.com/office/drawing/2016/ink" xmlns:am3d="http://schemas.microsoft.com/office/drawing/2017/model3d" xmlns:o="urn:schemas-microsoft-com:office:office" xmlns:oel="http://schemas.microsoft.com/office/2019/extlst" xmlns:r="http://schemas.openxmlformats.org/officeDocument/2006/relationships" xmlns:m="http://schemas.openxmlformats.org/officeDocument/2006/math" xmlns:v="urn:schemas-microsoft-com:vml" xmlns:wp14="http://schemas.microsoft.com/office/word/2010/wordprocessingDrawing" xmlns:wp="http://schemas.openxmlformats.org/drawingml/2006/wordprocessingDrawing" xmlns:w10="urn:schemas-microsoft-com:office:word" xmlns:w="http://schemas.openxmlformats.org/wordprocessingml/2006/main" xmlns:w14="http://schemas.microsoft.com/office/word/2010/wordml" xmlns:w15="http://schemas.microsoft.com/office/word/2012/wordml" xmlns:w16cex="http://schemas.microsoft.com/office/word/2018/wordml/cex" xmlns:w16cid="http://schemas.microsoft.com/office/word/2016/wordml/cid" xmlns:w16="http://schemas.microsoft.com/office/word/2018/wordml" xmlns:w16sdtdh="http://schemas.microsoft.com/office/word/2020/wordml/sdtdatahash" xmlns:w16se="http://schemas.microsoft.com/office/word/2015/wordml/symex" xmlns:wpg="http://schemas.microsoft.com/office/word/2010/wordprocessingGroup" xmlns:wpi="http://schemas.microsoft.com/office/word/2010/wordprocessingInk" xmlns:wne="http://schemas.microsoft.com/office/word/2006/wordml" xmlns:wps="http://schemas.microsoft.com/office/word/2010/wordprocessingShape" mc:Ignorable="w14 w15 w16se w16cid w16 w16cex w16sdtdh wp14">
+  <w:footnote w:type="separator" w:id="-1">
+    <w:p>
+      <w:pPr>
+        <w:spacing w:after="0" w:line="240" w:lineRule="auto"/>
+      </w:pPr>
+      <w:r>
+        <w:separator/>
+      </w:r>
+    </w:p>
+  </w:footnote>
+  <w:footnote w:type="continuationSeparator" w:id="0">
+    <w:p>
+      <w:pPr>
+        <w:spacing w:after="0" w:line="240" w:lineRule="auto"/>
+      </w:pPr>
+      <w:r>
+        <w:continuationSeparator/>
+      </w:r>
+    </w:p>
+  </w:footnote>
+</w:footnotes>
+</file>
+
 <file path=word/numbering.xml><?xml version="1.0" encoding="utf-8"?>
 <w:numbering xmlns:wpc="http://schemas.microsoft.com/office/word/2010/wordprocessingCanvas" xmlns:cx="http://schemas.microsoft.com/office/drawing/2014/chartex" xmlns:cx1="http://schemas.microsoft.com/office/drawing/2015/9/8/chartex" xmlns:cx2="http://schemas.microsoft.com/office/drawing/2015/10/21/chartex" xmlns:cx3="http://schemas.microsoft.com/office/drawing/2016/5/9/chartex" xmlns:cx4="http://schemas.microsoft.com/office/drawing/2016/5/10/chartex" xmlns:cx5="http://schemas.microsoft.com/office/drawing/2016/5/11/chartex" xmlns:cx6="http://schemas.microsoft.com/office/drawing/2016/5/12/chartex" xmlns:cx7="http://schemas.microsoft.com/office/drawing/2016/5/13/chartex" xmlns:cx8="http://schemas.microsoft.com/office/drawing/2016/5/14/chartex" xmlns:mc="http://schemas.openxmlformats.org/markup-compatibility/2006" xmlns:aink="http://schemas.microsoft.com/office/drawing/2016/ink" xmlns:am3d="http://schemas.microsoft.com/office/drawing/2017/model3d" xmlns:o="urn:schemas-microsoft-com:office:office" xmlns:oel="http://schemas.microsoft.com/office/2019/extlst" xmlns:r="http://schemas.openxmlformats.org/officeDocument/2006/relationships" xmlns:m="http://schemas.openxmlformats.org/officeDocument/2006/math" xmlns:v="urn:schemas-microsoft-com:vml" xmlns:wp14="http://schemas.microsoft.com/office/word/2010/wordprocessingDrawing" xmlns:wp="http://schemas.openxmlformats.org/drawingml/2006/wordprocessingDrawing" xmlns:w10="urn:schemas-microsoft-com:office:word" xmlns:w="http://schemas.openxmlformats.org/wordprocessingml/2006/main" xmlns:w14="http://schemas.microsoft.com/office/word/2010/wordml" xmlns:w15="http://schemas.microsoft.com/office/word/2012/wordml" xmlns:w16cex="http://schemas.microsoft.com/office/word/2018/wordml/cex" xmlns:w16cid="http://schemas.microsoft.com/office/word/2016/wordml/cid" xmlns:w16="http://schemas.microsoft.com/office/word/2018/wordml" xmlns:w16sdtdh="http://schemas.microsoft.com/office/word/2020/wordml/sdtdatahash" xmlns:w16se="http://schemas.microsoft.com/office/word/2015/wordml/symex" xmlns:wpg="http://schemas.microsoft.com/office/word/2010/wordprocessingGroup" xmlns:wpi="http://schemas.microsoft.com/office/word/2010/wordprocessingInk" xmlns:wne="http://schemas.microsoft.com/office/word/2006/wordml" xmlns:wps="http://schemas.microsoft.com/office/word/2010/wordprocessingShape" mc:Ignorable="w14 w15 w16se w16cid w16 w16cex w16sdtdh wp14">
   <w:abstractNum w:abstractNumId="0" w15:restartNumberingAfterBreak="0">
+    <w:nsid w:val="01B23AF6"/>
+    <w:multiLevelType w:val="hybridMultilevel"/>
+    <w:tmpl w:val="F8FEB7B4"/>
+    <w:lvl w:ilvl="0" w:tplc="62FCFD02">
+      <w:start w:val="1"/>
+      <w:numFmt w:val="bullet"/>
+      <w:lvlText w:val="-"/>
+      <w:lvlJc w:val="left"/>
+      <w:pPr>
+        <w:ind w:left="720" w:hanging="360"/>
+      </w:pPr>
+      <w:rPr>
+        <w:rFonts w:ascii="Aptos" w:eastAsiaTheme="minorHAnsi" w:hAnsi="Aptos" w:cstheme="minorBidi" w:hint="default"/>
+      </w:rPr>
+    </w:lvl>
+    <w:lvl w:ilvl="1" w:tplc="100C0003" w:tentative="1">
+      <w:start w:val="1"/>
+      <w:numFmt w:val="bullet"/>
+      <w:lvlText w:val="o"/>
+      <w:lvlJc w:val="left"/>
+      <w:pPr>
+        <w:ind w:left="1440" w:hanging="360"/>
+      </w:pPr>
+      <w:rPr>
+        <w:rFonts w:ascii="Courier New" w:hAnsi="Courier New" w:cs="Courier New" w:hint="default"/>
+      </w:rPr>
+    </w:lvl>
+    <w:lvl w:ilvl="2" w:tplc="100C0005" w:tentative="1">
+      <w:start w:val="1"/>
+      <w:numFmt w:val="bullet"/>
+      <w:lvlText w:val=""/>
+      <w:lvlJc w:val="left"/>
+      <w:pPr>
+        <w:ind w:left="2160" w:hanging="360"/>
+      </w:pPr>
+      <w:rPr>
+        <w:rFonts w:ascii="Wingdings" w:hAnsi="Wingdings" w:hint="default"/>
+      </w:rPr>
+    </w:lvl>
+    <w:lvl w:ilvl="3" w:tplc="100C0001" w:tentative="1">
+      <w:start w:val="1"/>
+      <w:numFmt w:val="bullet"/>
+      <w:lvlText w:val=""/>
+      <w:lvlJc w:val="left"/>
+      <w:pPr>
+        <w:ind w:left="2880" w:hanging="360"/>
+      </w:pPr>
+      <w:rPr>
+        <w:rFonts w:ascii="Symbol" w:hAnsi="Symbol" w:hint="default"/>
+      </w:rPr>
+    </w:lvl>
+    <w:lvl w:ilvl="4" w:tplc="100C0003" w:tentative="1">
+      <w:start w:val="1"/>
+      <w:numFmt w:val="bullet"/>
+      <w:lvlText w:val="o"/>
+      <w:lvlJc w:val="left"/>
+      <w:pPr>
+        <w:ind w:left="3600" w:hanging="360"/>
+      </w:pPr>
+      <w:rPr>
+        <w:rFonts w:ascii="Courier New" w:hAnsi="Courier New" w:cs="Courier New" w:hint="default"/>
+      </w:rPr>
+    </w:lvl>
+    <w:lvl w:ilvl="5" w:tplc="100C0005" w:tentative="1">
+      <w:start w:val="1"/>
+      <w:numFmt w:val="bullet"/>
+      <w:lvlText w:val=""/>
+      <w:lvlJc w:val="left"/>
+      <w:pPr>
+        <w:ind w:left="4320" w:hanging="360"/>
+      </w:pPr>
+      <w:rPr>
+        <w:rFonts w:ascii="Wingdings" w:hAnsi="Wingdings" w:hint="default"/>
+      </w:rPr>
+    </w:lvl>
+    <w:lvl w:ilvl="6" w:tplc="100C0001" w:tentative="1">
+      <w:start w:val="1"/>
+      <w:numFmt w:val="bullet"/>
+      <w:lvlText w:val=""/>
+      <w:lvlJc w:val="left"/>
+      <w:pPr>
+        <w:ind w:left="5040" w:hanging="360"/>
+      </w:pPr>
+      <w:rPr>
+        <w:rFonts w:ascii="Symbol" w:hAnsi="Symbol" w:hint="default"/>
+      </w:rPr>
+    </w:lvl>
+    <w:lvl w:ilvl="7" w:tplc="100C0003" w:tentative="1">
+      <w:start w:val="1"/>
+      <w:numFmt w:val="bullet"/>
+      <w:lvlText w:val="o"/>
+      <w:lvlJc w:val="left"/>
+      <w:pPr>
+        <w:ind w:left="5760" w:hanging="360"/>
+      </w:pPr>
+      <w:rPr>
+        <w:rFonts w:ascii="Courier New" w:hAnsi="Courier New" w:cs="Courier New" w:hint="default"/>
+      </w:rPr>
+    </w:lvl>
+    <w:lvl w:ilvl="8" w:tplc="100C0005" w:tentative="1">
+      <w:start w:val="1"/>
+      <w:numFmt w:val="bullet"/>
+      <w:lvlText w:val=""/>
+      <w:lvlJc w:val="left"/>
+      <w:pPr>
+        <w:ind w:left="6480" w:hanging="360"/>
+      </w:pPr>
+      <w:rPr>
+        <w:rFonts w:ascii="Wingdings" w:hAnsi="Wingdings" w:hint="default"/>
+      </w:rPr>
+    </w:lvl>
+  </w:abstractNum>
+  <w:abstractNum w:abstractNumId="1" w15:restartNumberingAfterBreak="0">
+    <w:nsid w:val="029E0CF5"/>
+    <w:multiLevelType w:val="hybridMultilevel"/>
+    <w:tmpl w:val="8F7AB4A2"/>
+    <w:lvl w:ilvl="0" w:tplc="100C000F">
+      <w:start w:val="1"/>
+      <w:numFmt w:val="decimal"/>
+      <w:lvlText w:val="%1."/>
+      <w:lvlJc w:val="left"/>
+      <w:pPr>
+        <w:ind w:left="720" w:hanging="360"/>
+      </w:pPr>
+      <w:rPr>
+        <w:rFonts w:hint="default"/>
+      </w:rPr>
+    </w:lvl>
+    <w:lvl w:ilvl="1" w:tplc="100C0019" w:tentative="1">
+      <w:start w:val="1"/>
+      <w:numFmt w:val="lowerLetter"/>
+      <w:lvlText w:val="%2."/>
+      <w:lvlJc w:val="left"/>
+      <w:pPr>
+        <w:ind w:left="1440" w:hanging="360"/>
+      </w:pPr>
+    </w:lvl>
+    <w:lvl w:ilvl="2" w:tplc="100C001B" w:tentative="1">
+      <w:start w:val="1"/>
+      <w:numFmt w:val="lowerRoman"/>
+      <w:lvlText w:val="%3."/>
+      <w:lvlJc w:val="right"/>
+      <w:pPr>
+        <w:ind w:left="2160" w:hanging="180"/>
+      </w:pPr>
+    </w:lvl>
+    <w:lvl w:ilvl="3" w:tplc="100C000F" w:tentative="1">
+      <w:start w:val="1"/>
+      <w:numFmt w:val="decimal"/>
+      <w:lvlText w:val="%4."/>
+      <w:lvlJc w:val="left"/>
+      <w:pPr>
+        <w:ind w:left="2880" w:hanging="360"/>
+      </w:pPr>
+    </w:lvl>
+    <w:lvl w:ilvl="4" w:tplc="100C0019" w:tentative="1">
+      <w:start w:val="1"/>
+      <w:numFmt w:val="lowerLetter"/>
+      <w:lvlText w:val="%5."/>
+      <w:lvlJc w:val="left"/>
+      <w:pPr>
+        <w:ind w:left="3600" w:hanging="360"/>
+      </w:pPr>
+    </w:lvl>
+    <w:lvl w:ilvl="5" w:tplc="100C001B" w:tentative="1">
+      <w:start w:val="1"/>
+      <w:numFmt w:val="lowerRoman"/>
+      <w:lvlText w:val="%6."/>
+      <w:lvlJc w:val="right"/>
+      <w:pPr>
+        <w:ind w:left="4320" w:hanging="180"/>
+      </w:pPr>
+    </w:lvl>
+    <w:lvl w:ilvl="6" w:tplc="100C000F" w:tentative="1">
+      <w:start w:val="1"/>
+      <w:numFmt w:val="decimal"/>
+      <w:lvlText w:val="%7."/>
+      <w:lvlJc w:val="left"/>
+      <w:pPr>
+        <w:ind w:left="5040" w:hanging="360"/>
+      </w:pPr>
+    </w:lvl>
+    <w:lvl w:ilvl="7" w:tplc="100C0019" w:tentative="1">
+      <w:start w:val="1"/>
+      <w:numFmt w:val="lowerLetter"/>
+      <w:lvlText w:val="%8."/>
+      <w:lvlJc w:val="left"/>
+      <w:pPr>
+        <w:ind w:left="5760" w:hanging="360"/>
+      </w:pPr>
+    </w:lvl>
+    <w:lvl w:ilvl="8" w:tplc="100C001B" w:tentative="1">
+      <w:start w:val="1"/>
+      <w:numFmt w:val="lowerRoman"/>
+      <w:lvlText w:val="%9."/>
+      <w:lvlJc w:val="right"/>
+      <w:pPr>
+        <w:ind w:left="6480" w:hanging="180"/>
+      </w:pPr>
+    </w:lvl>
+  </w:abstractNum>
+  <w:abstractNum w:abstractNumId="2" w15:restartNumberingAfterBreak="0">
     <w:nsid w:val="0C1B1800"/>
     <w:multiLevelType w:val="hybridMultilevel"/>
     <w:tmpl w:val="B2B2EC7A"/>
@@ -404,7 +1829,185 @@
       </w:pPr>
     </w:lvl>
   </w:abstractNum>
-  <w:abstractNum w:abstractNumId="1" w15:restartNumberingAfterBreak="0">
+  <w:abstractNum w:abstractNumId="3" w15:restartNumberingAfterBreak="0">
+    <w:nsid w:val="0CB40369"/>
+    <w:multiLevelType w:val="hybridMultilevel"/>
+    <w:tmpl w:val="1B482218"/>
+    <w:lvl w:ilvl="0" w:tplc="100C0019">
+      <w:start w:val="1"/>
+      <w:numFmt w:val="lowerLetter"/>
+      <w:lvlText w:val="%1."/>
+      <w:lvlJc w:val="left"/>
+      <w:pPr>
+        <w:ind w:left="720" w:hanging="360"/>
+      </w:pPr>
+      <w:rPr>
+        <w:rFonts w:hint="default"/>
+      </w:rPr>
+    </w:lvl>
+    <w:lvl w:ilvl="1" w:tplc="100C0019" w:tentative="1">
+      <w:start w:val="1"/>
+      <w:numFmt w:val="lowerLetter"/>
+      <w:lvlText w:val="%2."/>
+      <w:lvlJc w:val="left"/>
+      <w:pPr>
+        <w:ind w:left="1440" w:hanging="360"/>
+      </w:pPr>
+    </w:lvl>
+    <w:lvl w:ilvl="2" w:tplc="100C001B" w:tentative="1">
+      <w:start w:val="1"/>
+      <w:numFmt w:val="lowerRoman"/>
+      <w:lvlText w:val="%3."/>
+      <w:lvlJc w:val="right"/>
+      <w:pPr>
+        <w:ind w:left="2160" w:hanging="180"/>
+      </w:pPr>
+    </w:lvl>
+    <w:lvl w:ilvl="3" w:tplc="100C000F" w:tentative="1">
+      <w:start w:val="1"/>
+      <w:numFmt w:val="decimal"/>
+      <w:lvlText w:val="%4."/>
+      <w:lvlJc w:val="left"/>
+      <w:pPr>
+        <w:ind w:left="2880" w:hanging="360"/>
+      </w:pPr>
+    </w:lvl>
+    <w:lvl w:ilvl="4" w:tplc="100C0019" w:tentative="1">
+      <w:start w:val="1"/>
+      <w:numFmt w:val="lowerLetter"/>
+      <w:lvlText w:val="%5."/>
+      <w:lvlJc w:val="left"/>
+      <w:pPr>
+        <w:ind w:left="3600" w:hanging="360"/>
+      </w:pPr>
+    </w:lvl>
+    <w:lvl w:ilvl="5" w:tplc="100C001B" w:tentative="1">
+      <w:start w:val="1"/>
+      <w:numFmt w:val="lowerRoman"/>
+      <w:lvlText w:val="%6."/>
+      <w:lvlJc w:val="right"/>
+      <w:pPr>
+        <w:ind w:left="4320" w:hanging="180"/>
+      </w:pPr>
+    </w:lvl>
+    <w:lvl w:ilvl="6" w:tplc="100C000F" w:tentative="1">
+      <w:start w:val="1"/>
+      <w:numFmt w:val="decimal"/>
+      <w:lvlText w:val="%7."/>
+      <w:lvlJc w:val="left"/>
+      <w:pPr>
+        <w:ind w:left="5040" w:hanging="360"/>
+      </w:pPr>
+    </w:lvl>
+    <w:lvl w:ilvl="7" w:tplc="100C0019" w:tentative="1">
+      <w:start w:val="1"/>
+      <w:numFmt w:val="lowerLetter"/>
+      <w:lvlText w:val="%8."/>
+      <w:lvlJc w:val="left"/>
+      <w:pPr>
+        <w:ind w:left="5760" w:hanging="360"/>
+      </w:pPr>
+    </w:lvl>
+    <w:lvl w:ilvl="8" w:tplc="100C001B" w:tentative="1">
+      <w:start w:val="1"/>
+      <w:numFmt w:val="lowerRoman"/>
+      <w:lvlText w:val="%9."/>
+      <w:lvlJc w:val="right"/>
+      <w:pPr>
+        <w:ind w:left="6480" w:hanging="180"/>
+      </w:pPr>
+    </w:lvl>
+  </w:abstractNum>
+  <w:abstractNum w:abstractNumId="4" w15:restartNumberingAfterBreak="0">
+    <w:nsid w:val="144137BB"/>
+    <w:multiLevelType w:val="hybridMultilevel"/>
+    <w:tmpl w:val="5F06EFD8"/>
+    <w:lvl w:ilvl="0" w:tplc="100C0019">
+      <w:start w:val="1"/>
+      <w:numFmt w:val="lowerLetter"/>
+      <w:lvlText w:val="%1."/>
+      <w:lvlJc w:val="left"/>
+      <w:pPr>
+        <w:ind w:left="720" w:hanging="360"/>
+      </w:pPr>
+      <w:rPr>
+        <w:rFonts w:hint="default"/>
+      </w:rPr>
+    </w:lvl>
+    <w:lvl w:ilvl="1" w:tplc="100C0019" w:tentative="1">
+      <w:start w:val="1"/>
+      <w:numFmt w:val="lowerLetter"/>
+      <w:lvlText w:val="%2."/>
+      <w:lvlJc w:val="left"/>
+      <w:pPr>
+        <w:ind w:left="1440" w:hanging="360"/>
+      </w:pPr>
+    </w:lvl>
+    <w:lvl w:ilvl="2" w:tplc="100C001B" w:tentative="1">
+      <w:start w:val="1"/>
+      <w:numFmt w:val="lowerRoman"/>
+      <w:lvlText w:val="%3."/>
+      <w:lvlJc w:val="right"/>
+      <w:pPr>
+        <w:ind w:left="2160" w:hanging="180"/>
+      </w:pPr>
+    </w:lvl>
+    <w:lvl w:ilvl="3" w:tplc="100C000F" w:tentative="1">
+      <w:start w:val="1"/>
+      <w:numFmt w:val="decimal"/>
+      <w:lvlText w:val="%4."/>
+      <w:lvlJc w:val="left"/>
+      <w:pPr>
+        <w:ind w:left="2880" w:hanging="360"/>
+      </w:pPr>
+    </w:lvl>
+    <w:lvl w:ilvl="4" w:tplc="100C0019" w:tentative="1">
+      <w:start w:val="1"/>
+      <w:numFmt w:val="lowerLetter"/>
+      <w:lvlText w:val="%5."/>
+      <w:lvlJc w:val="left"/>
+      <w:pPr>
+        <w:ind w:left="3600" w:hanging="360"/>
+      </w:pPr>
+    </w:lvl>
+    <w:lvl w:ilvl="5" w:tplc="100C001B" w:tentative="1">
+      <w:start w:val="1"/>
+      <w:numFmt w:val="lowerRoman"/>
+      <w:lvlText w:val="%6."/>
+      <w:lvlJc w:val="right"/>
+      <w:pPr>
+        <w:ind w:left="4320" w:hanging="180"/>
+      </w:pPr>
+    </w:lvl>
+    <w:lvl w:ilvl="6" w:tplc="100C000F" w:tentative="1">
+      <w:start w:val="1"/>
+      <w:numFmt w:val="decimal"/>
+      <w:lvlText w:val="%7."/>
+      <w:lvlJc w:val="left"/>
+      <w:pPr>
+        <w:ind w:left="5040" w:hanging="360"/>
+      </w:pPr>
+    </w:lvl>
+    <w:lvl w:ilvl="7" w:tplc="100C0019" w:tentative="1">
+      <w:start w:val="1"/>
+      <w:numFmt w:val="lowerLetter"/>
+      <w:lvlText w:val="%8."/>
+      <w:lvlJc w:val="left"/>
+      <w:pPr>
+        <w:ind w:left="5760" w:hanging="360"/>
+      </w:pPr>
+    </w:lvl>
+    <w:lvl w:ilvl="8" w:tplc="100C001B" w:tentative="1">
+      <w:start w:val="1"/>
+      <w:numFmt w:val="lowerRoman"/>
+      <w:lvlText w:val="%9."/>
+      <w:lvlJc w:val="right"/>
+      <w:pPr>
+        <w:ind w:left="6480" w:hanging="180"/>
+      </w:pPr>
+    </w:lvl>
+  </w:abstractNum>
+  <w:abstractNum w:abstractNumId="5" w15:restartNumberingAfterBreak="0">
     <w:nsid w:val="231056B7"/>
     <w:multiLevelType w:val="hybridMultilevel"/>
     <w:tmpl w:val="F6607708"/>
@@ -517,7 +2120,96 @@
       </w:rPr>
     </w:lvl>
   </w:abstractNum>
-  <w:abstractNum w:abstractNumId="2" w15:restartNumberingAfterBreak="0">
+  <w:abstractNum w:abstractNumId="6" w15:restartNumberingAfterBreak="0">
+    <w:nsid w:val="2CCF47AA"/>
+    <w:multiLevelType w:val="hybridMultilevel"/>
+    <w:tmpl w:val="0F8A83F2"/>
+    <w:lvl w:ilvl="0" w:tplc="100C000F">
+      <w:start w:val="1"/>
+      <w:numFmt w:val="decimal"/>
+      <w:lvlText w:val="%1."/>
+      <w:lvlJc w:val="left"/>
+      <w:pPr>
+        <w:ind w:left="720" w:hanging="360"/>
+      </w:pPr>
+      <w:rPr>
+        <w:rFonts w:hint="default"/>
+      </w:rPr>
+    </w:lvl>
+    <w:lvl w:ilvl="1" w:tplc="100C0019" w:tentative="1">
+      <w:start w:val="1"/>
+      <w:numFmt w:val="lowerLetter"/>
+      <w:lvlText w:val="%2."/>
+      <w:lvlJc w:val="left"/>
+      <w:pPr>
+        <w:ind w:left="1440" w:hanging="360"/>
+      </w:pPr>
+    </w:lvl>
+    <w:lvl w:ilvl="2" w:tplc="100C001B" w:tentative="1">
+      <w:start w:val="1"/>
+      <w:numFmt w:val="lowerRoman"/>
+      <w:lvlText w:val="%3."/>
+      <w:lvlJc w:val="right"/>
+      <w:pPr>
+        <w:ind w:left="2160" w:hanging="180"/>
+      </w:pPr>
+    </w:lvl>
+    <w:lvl w:ilvl="3" w:tplc="100C000F" w:tentative="1">
+      <w:start w:val="1"/>
+      <w:numFmt w:val="decimal"/>
+      <w:lvlText w:val="%4."/>
+      <w:lvlJc w:val="left"/>
+      <w:pPr>
+        <w:ind w:left="2880" w:hanging="360"/>
+      </w:pPr>
+    </w:lvl>
+    <w:lvl w:ilvl="4" w:tplc="100C0019" w:tentative="1">
+      <w:start w:val="1"/>
+      <w:numFmt w:val="lowerLetter"/>
+      <w:lvlText w:val="%5."/>
+      <w:lvlJc w:val="left"/>
+      <w:pPr>
+        <w:ind w:left="3600" w:hanging="360"/>
+      </w:pPr>
+    </w:lvl>
+    <w:lvl w:ilvl="5" w:tplc="100C001B" w:tentative="1">
+      <w:start w:val="1"/>
+      <w:numFmt w:val="lowerRoman"/>
+      <w:lvlText w:val="%6."/>
+      <w:lvlJc w:val="right"/>
+      <w:pPr>
+        <w:ind w:left="4320" w:hanging="180"/>
+      </w:pPr>
+    </w:lvl>
+    <w:lvl w:ilvl="6" w:tplc="100C000F" w:tentative="1">
+      <w:start w:val="1"/>
+      <w:numFmt w:val="decimal"/>
+      <w:lvlText w:val="%7."/>
+      <w:lvlJc w:val="left"/>
+      <w:pPr>
+        <w:ind w:left="5040" w:hanging="360"/>
+      </w:pPr>
+    </w:lvl>
+    <w:lvl w:ilvl="7" w:tplc="100C0019" w:tentative="1">
+      <w:start w:val="1"/>
+      <w:numFmt w:val="lowerLetter"/>
+      <w:lvlText w:val="%8."/>
+      <w:lvlJc w:val="left"/>
+      <w:pPr>
+        <w:ind w:left="5760" w:hanging="360"/>
+      </w:pPr>
+    </w:lvl>
+    <w:lvl w:ilvl="8" w:tplc="100C001B" w:tentative="1">
+      <w:start w:val="1"/>
+      <w:numFmt w:val="lowerRoman"/>
+      <w:lvlText w:val="%9."/>
+      <w:lvlJc w:val="right"/>
+      <w:pPr>
+        <w:ind w:left="6480" w:hanging="180"/>
+      </w:pPr>
+    </w:lvl>
+  </w:abstractNum>
+  <w:abstractNum w:abstractNumId="7" w15:restartNumberingAfterBreak="0">
     <w:nsid w:val="345F6DA0"/>
     <w:multiLevelType w:val="hybridMultilevel"/>
     <w:tmpl w:val="7786DCB4"/>
@@ -606,14 +2298,213 @@
       </w:pPr>
     </w:lvl>
   </w:abstractNum>
+  <w:abstractNum w:abstractNumId="8" w15:restartNumberingAfterBreak="0">
+    <w:nsid w:val="55D17F2B"/>
+    <w:multiLevelType w:val="hybridMultilevel"/>
+    <w:tmpl w:val="00C4B8B6"/>
+    <w:lvl w:ilvl="0" w:tplc="100C0019">
+      <w:start w:val="1"/>
+      <w:numFmt w:val="lowerLetter"/>
+      <w:lvlText w:val="%1."/>
+      <w:lvlJc w:val="left"/>
+      <w:pPr>
+        <w:ind w:left="1068" w:hanging="360"/>
+      </w:pPr>
+      <w:rPr>
+        <w:rFonts w:hint="default"/>
+      </w:rPr>
+    </w:lvl>
+    <w:lvl w:ilvl="1" w:tplc="100C0019" w:tentative="1">
+      <w:start w:val="1"/>
+      <w:numFmt w:val="lowerLetter"/>
+      <w:lvlText w:val="%2."/>
+      <w:lvlJc w:val="left"/>
+      <w:pPr>
+        <w:ind w:left="1788" w:hanging="360"/>
+      </w:pPr>
+    </w:lvl>
+    <w:lvl w:ilvl="2" w:tplc="100C001B" w:tentative="1">
+      <w:start w:val="1"/>
+      <w:numFmt w:val="lowerRoman"/>
+      <w:lvlText w:val="%3."/>
+      <w:lvlJc w:val="right"/>
+      <w:pPr>
+        <w:ind w:left="2508" w:hanging="180"/>
+      </w:pPr>
+    </w:lvl>
+    <w:lvl w:ilvl="3" w:tplc="100C000F" w:tentative="1">
+      <w:start w:val="1"/>
+      <w:numFmt w:val="decimal"/>
+      <w:lvlText w:val="%4."/>
+      <w:lvlJc w:val="left"/>
+      <w:pPr>
+        <w:ind w:left="3228" w:hanging="360"/>
+      </w:pPr>
+    </w:lvl>
+    <w:lvl w:ilvl="4" w:tplc="100C0019" w:tentative="1">
+      <w:start w:val="1"/>
+      <w:numFmt w:val="lowerLetter"/>
+      <w:lvlText w:val="%5."/>
+      <w:lvlJc w:val="left"/>
+      <w:pPr>
+        <w:ind w:left="3948" w:hanging="360"/>
+      </w:pPr>
+    </w:lvl>
+    <w:lvl w:ilvl="5" w:tplc="100C001B" w:tentative="1">
+      <w:start w:val="1"/>
+      <w:numFmt w:val="lowerRoman"/>
+      <w:lvlText w:val="%6."/>
+      <w:lvlJc w:val="right"/>
+      <w:pPr>
+        <w:ind w:left="4668" w:hanging="180"/>
+      </w:pPr>
+    </w:lvl>
+    <w:lvl w:ilvl="6" w:tplc="100C000F" w:tentative="1">
+      <w:start w:val="1"/>
+      <w:numFmt w:val="decimal"/>
+      <w:lvlText w:val="%7."/>
+      <w:lvlJc w:val="left"/>
+      <w:pPr>
+        <w:ind w:left="5388" w:hanging="360"/>
+      </w:pPr>
+    </w:lvl>
+    <w:lvl w:ilvl="7" w:tplc="100C0019" w:tentative="1">
+      <w:start w:val="1"/>
+      <w:numFmt w:val="lowerLetter"/>
+      <w:lvlText w:val="%8."/>
+      <w:lvlJc w:val="left"/>
+      <w:pPr>
+        <w:ind w:left="6108" w:hanging="360"/>
+      </w:pPr>
+    </w:lvl>
+    <w:lvl w:ilvl="8" w:tplc="100C001B" w:tentative="1">
+      <w:start w:val="1"/>
+      <w:numFmt w:val="lowerRoman"/>
+      <w:lvlText w:val="%9."/>
+      <w:lvlJc w:val="right"/>
+      <w:pPr>
+        <w:ind w:left="6828" w:hanging="180"/>
+      </w:pPr>
+    </w:lvl>
+  </w:abstractNum>
+  <w:abstractNum w:abstractNumId="9" w15:restartNumberingAfterBreak="0">
+    <w:nsid w:val="796E489E"/>
+    <w:multiLevelType w:val="hybridMultilevel"/>
+    <w:tmpl w:val="B18CD456"/>
+    <w:lvl w:ilvl="0" w:tplc="A6C2C9C6">
+      <w:start w:val="1"/>
+      <w:numFmt w:val="lowerLetter"/>
+      <w:lvlText w:val="%1."/>
+      <w:lvlJc w:val="left"/>
+      <w:pPr>
+        <w:ind w:left="720" w:hanging="360"/>
+      </w:pPr>
+      <w:rPr>
+        <w:rFonts w:asciiTheme="minorHAnsi" w:eastAsiaTheme="minorHAnsi" w:hAnsiTheme="minorHAnsi" w:cstheme="minorBidi"/>
+      </w:rPr>
+    </w:lvl>
+    <w:lvl w:ilvl="1" w:tplc="100C0019">
+      <w:start w:val="1"/>
+      <w:numFmt w:val="lowerLetter"/>
+      <w:lvlText w:val="%2."/>
+      <w:lvlJc w:val="left"/>
+      <w:pPr>
+        <w:ind w:left="1440" w:hanging="360"/>
+      </w:pPr>
+    </w:lvl>
+    <w:lvl w:ilvl="2" w:tplc="100C001B">
+      <w:start w:val="1"/>
+      <w:numFmt w:val="lowerRoman"/>
+      <w:lvlText w:val="%3."/>
+      <w:lvlJc w:val="right"/>
+      <w:pPr>
+        <w:ind w:left="2160" w:hanging="180"/>
+      </w:pPr>
+    </w:lvl>
+    <w:lvl w:ilvl="3" w:tplc="100C000F" w:tentative="1">
+      <w:start w:val="1"/>
+      <w:numFmt w:val="decimal"/>
+      <w:lvlText w:val="%4."/>
+      <w:lvlJc w:val="left"/>
+      <w:pPr>
+        <w:ind w:left="2880" w:hanging="360"/>
+      </w:pPr>
+    </w:lvl>
+    <w:lvl w:ilvl="4" w:tplc="100C0019" w:tentative="1">
+      <w:start w:val="1"/>
+      <w:numFmt w:val="lowerLetter"/>
+      <w:lvlText w:val="%5."/>
+      <w:lvlJc w:val="left"/>
+      <w:pPr>
+        <w:ind w:left="3600" w:hanging="360"/>
+      </w:pPr>
+    </w:lvl>
+    <w:lvl w:ilvl="5" w:tplc="100C001B" w:tentative="1">
+      <w:start w:val="1"/>
+      <w:numFmt w:val="lowerRoman"/>
+      <w:lvlText w:val="%6."/>
+      <w:lvlJc w:val="right"/>
+      <w:pPr>
+        <w:ind w:left="4320" w:hanging="180"/>
+      </w:pPr>
+    </w:lvl>
+    <w:lvl w:ilvl="6" w:tplc="100C000F" w:tentative="1">
+      <w:start w:val="1"/>
+      <w:numFmt w:val="decimal"/>
+      <w:lvlText w:val="%7."/>
+      <w:lvlJc w:val="left"/>
+      <w:pPr>
+        <w:ind w:left="5040" w:hanging="360"/>
+      </w:pPr>
+    </w:lvl>
+    <w:lvl w:ilvl="7" w:tplc="100C0019" w:tentative="1">
+      <w:start w:val="1"/>
+      <w:numFmt w:val="lowerLetter"/>
+      <w:lvlText w:val="%8."/>
+      <w:lvlJc w:val="left"/>
+      <w:pPr>
+        <w:ind w:left="5760" w:hanging="360"/>
+      </w:pPr>
+    </w:lvl>
+    <w:lvl w:ilvl="8" w:tplc="100C001B" w:tentative="1">
+      <w:start w:val="1"/>
+      <w:numFmt w:val="lowerRoman"/>
+      <w:lvlText w:val="%9."/>
+      <w:lvlJc w:val="right"/>
+      <w:pPr>
+        <w:ind w:left="6480" w:hanging="180"/>
+      </w:pPr>
+    </w:lvl>
+  </w:abstractNum>
   <w:num w:numId="1" w16cid:durableId="1117605861">
+    <w:abstractNumId w:val="2"/>
+  </w:num>
+  <w:num w:numId="2" w16cid:durableId="1751342210">
+    <w:abstractNumId w:val="7"/>
+  </w:num>
+  <w:num w:numId="3" w16cid:durableId="1614558261">
+    <w:abstractNumId w:val="5"/>
+  </w:num>
+  <w:num w:numId="4" w16cid:durableId="1011643277">
+    <w:abstractNumId w:val="1"/>
+  </w:num>
+  <w:num w:numId="5" w16cid:durableId="404450574">
+    <w:abstractNumId w:val="6"/>
+  </w:num>
+  <w:num w:numId="6" w16cid:durableId="288440098">
     <w:abstractNumId w:val="0"/>
   </w:num>
-  <w:num w:numId="2" w16cid:durableId="1751342210">
-    <w:abstractNumId w:val="2"/>
+  <w:num w:numId="7" w16cid:durableId="1632125195">
+    <w:abstractNumId w:val="9"/>
   </w:num>
-  <w:num w:numId="3" w16cid:durableId="1614558261">
-    <w:abstractNumId w:val="1"/>
+  <w:num w:numId="8" w16cid:durableId="1188254905">
+    <w:abstractNumId w:val="8"/>
+  </w:num>
+  <w:num w:numId="9" w16cid:durableId="428546316">
+    <w:abstractNumId w:val="3"/>
+  </w:num>
+  <w:num w:numId="10" w16cid:durableId="2003268306">
+    <w:abstractNumId w:val="4"/>
   </w:num>
 </w:numbering>
 </file>
@@ -1220,6 +3111,7 @@
   <w:style w:type="character" w:default="1" w:styleId="Policepardfaut">
     <w:name w:val="Default Paragraph Font"/>
     <w:uiPriority w:val="1"/>
+    <w:semiHidden/>
     <w:unhideWhenUsed/>
   </w:style>
   <w:style w:type="table" w:default="1" w:styleId="TableauNormal">
@@ -1553,6 +3445,69 @@
     <w:rPr>
       <w:color w:val="605E5C"/>
       <w:shd w:val="clear" w:color="auto" w:fill="E1DFDD"/>
+    </w:rPr>
+  </w:style>
+  <w:style w:type="paragraph" w:styleId="En-tte">
+    <w:name w:val="header"/>
+    <w:basedOn w:val="Normal"/>
+    <w:link w:val="En-tteCar"/>
+    <w:uiPriority w:val="99"/>
+    <w:unhideWhenUsed/>
+    <w:rsid w:val="006B58CB"/>
+    <w:pPr>
+      <w:tabs>
+        <w:tab w:val="center" w:pos="4536"/>
+        <w:tab w:val="right" w:pos="9072"/>
+      </w:tabs>
+      <w:spacing w:after="0" w:line="240" w:lineRule="auto"/>
+    </w:pPr>
+  </w:style>
+  <w:style w:type="character" w:customStyle="1" w:styleId="En-tteCar">
+    <w:name w:val="En-tête Car"/>
+    <w:basedOn w:val="Policepardfaut"/>
+    <w:link w:val="En-tte"/>
+    <w:uiPriority w:val="99"/>
+    <w:rsid w:val="006B58CB"/>
+  </w:style>
+  <w:style w:type="paragraph" w:styleId="Pieddepage">
+    <w:name w:val="footer"/>
+    <w:basedOn w:val="Normal"/>
+    <w:link w:val="PieddepageCar"/>
+    <w:uiPriority w:val="99"/>
+    <w:unhideWhenUsed/>
+    <w:rsid w:val="006B58CB"/>
+    <w:pPr>
+      <w:tabs>
+        <w:tab w:val="center" w:pos="4536"/>
+        <w:tab w:val="right" w:pos="9072"/>
+      </w:tabs>
+      <w:spacing w:after="0" w:line="240" w:lineRule="auto"/>
+    </w:pPr>
+  </w:style>
+  <w:style w:type="character" w:customStyle="1" w:styleId="PieddepageCar">
+    <w:name w:val="Pied de page Car"/>
+    <w:basedOn w:val="Policepardfaut"/>
+    <w:link w:val="Pieddepage"/>
+    <w:uiPriority w:val="99"/>
+    <w:rsid w:val="006B58CB"/>
+  </w:style>
+  <w:style w:type="paragraph" w:styleId="Lgende">
+    <w:name w:val="caption"/>
+    <w:basedOn w:val="Normal"/>
+    <w:next w:val="Normal"/>
+    <w:uiPriority w:val="35"/>
+    <w:unhideWhenUsed/>
+    <w:qFormat/>
+    <w:rsid w:val="00BE76EF"/>
+    <w:pPr>
+      <w:spacing w:after="200" w:line="240" w:lineRule="auto"/>
+    </w:pPr>
+    <w:rPr>
+      <w:i/>
+      <w:iCs/>
+      <w:color w:val="0E2841" w:themeColor="text2"/>
+      <w:sz w:val="18"/>
+      <w:szCs w:val="18"/>
     </w:rPr>
   </w:style>
 </w:styles>

</xml_diff>